<commit_message>
docs: update integration guide with correct LogSource config and LMQL queries
Updated field extraction to use JSONPath WebhookAttribute and RegexGroup
methods. Added external labels documentation. Fixed LMQL queries to use
_lm.logsource_name. Added lm_logs_administrator role requirement and
webhook platform limitation notes. Regenerated .docx.
</commit_message>
<xml_diff>
--- a/docs/Prometheus-AlertManager-LogicMonitor-Integration-Guide.docx
+++ b/docs/Prometheus-AlertManager-LogicMonitor-Integration-Guide.docx
@@ -24,38 +24,65 @@
       </w:r>
     </w:p>
     <w:p>
+      <w:pPr>
+        <w:pStyle w:val="NoSpacing"/>
+        <w:spacing w:before="80" w:after="80"/>
+        <w:ind w:left="432"/>
+      </w:pPr>
       <w:r>
-        <w:t>Prometheus  --&gt;  AlertManager  --&gt;  LM Webhook LogSource  --&gt;  LM Logs  --&gt;  LogAlerts</w:t>
+        <w:rPr>
+          <w:rFonts w:ascii="Courier New" w:hAnsi="Courier New"/>
+          <w:sz w:val="16"/>
+        </w:rPr>
+        <w:t>Prometheus --&gt; AlertManager --&gt; LM Webhook LogSource --&gt; LM Logs --&gt; LogAlerts</w:t>
       </w:r>
     </w:p>
     <w:p>
+      <w:pPr>
+        <w:pStyle w:val="ListNumber"/>
+      </w:pPr>
       <w:r>
-        <w:t>1. Prometheus evaluates alerting rules defined in PrometheusRules.</w:t>
+        <w:t>Prometheus evaluates alerting rules defined in PrometheusRules.</w:t>
       </w:r>
     </w:p>
     <w:p>
+      <w:pPr>
+        <w:pStyle w:val="ListNumber"/>
+      </w:pPr>
       <w:r>
-        <w:t>2. AlertManager receives alerts and routes them based on labels (namespace, severity).</w:t>
+        <w:t>AlertManager receives alerts and routes them based on labels (namespace, severity).</w:t>
       </w:r>
     </w:p>
     <w:p>
+      <w:pPr>
+        <w:pStyle w:val="ListNumber"/>
+      </w:pPr>
       <w:r>
-        <w:t>3. AlertManager POSTs a JSON payload to the LogicMonitor webhook endpoint.</w:t>
+        <w:t>AlertManager POSTs a JSON payload to the LogicMonitor webhook endpoint.</w:t>
       </w:r>
     </w:p>
     <w:p>
+      <w:pPr>
+        <w:pStyle w:val="ListNumber"/>
+      </w:pPr>
       <w:r>
-        <w:t>4. The LogicMonitor LogSource parses the payload and extracts structured fields.</w:t>
+        <w:t>The LogicMonitor LogSource parses the payload and extracts structured fields.</w:t>
       </w:r>
     </w:p>
     <w:p>
+      <w:pPr>
+        <w:pStyle w:val="ListNumber"/>
+      </w:pPr>
       <w:r>
-        <w:t>5. Resource mapping correlates logs to monitored Kubernetes cluster resources.</w:t>
+        <w:t>Resource mapping stores cluster and alert attributes on log entries.</w:t>
       </w:r>
     </w:p>
     <w:p>
+      <w:pPr>
+        <w:pStyle w:val="ListNumber"/>
+      </w:pPr>
       <w:r>
-        <w:t>6. LogAlerts evaluate log patterns and generate LogicMonitor alerts.</w:t>
+        <w:t>LogAlerts evaluate log patterns and generate LogicMonitor alerts.</w:t>
       </w:r>
     </w:p>
     <w:p>
@@ -68,7 +95,7 @@
     </w:p>
     <w:tbl>
       <w:tblPr>
-        <w:tblStyle w:val="LightList-Accent1"/>
+        <w:tblStyle w:val="LightGrid-Accent1"/>
         <w:tblW w:type="auto" w:w="0"/>
         <w:tblLook w:firstColumn="1" w:firstRow="1" w:lastColumn="0" w:lastRow="0" w:noHBand="0" w:noVBand="1" w:val="04A0"/>
       </w:tblPr>
@@ -83,6 +110,10 @@
           </w:tcPr>
           <w:p>
             <w:r>
+              <w:rPr>
+                <w:b/>
+                <w:sz w:val="18"/>
+              </w:rPr>
               <w:t>Requirement</w:t>
             </w:r>
           </w:p>
@@ -93,6 +124,10 @@
           </w:tcPr>
           <w:p>
             <w:r>
+              <w:rPr>
+                <w:b/>
+                <w:sz w:val="18"/>
+              </w:rPr>
               <w:t>Details</w:t>
             </w:r>
           </w:p>
@@ -105,6 +140,9 @@
           </w:tcPr>
           <w:p>
             <w:r>
+              <w:rPr>
+                <w:sz w:val="18"/>
+              </w:rPr>
               <w:t>OpenShift Version</w:t>
             </w:r>
           </w:p>
@@ -115,6 +153,9 @@
           </w:tcPr>
           <w:p>
             <w:r>
+              <w:rPr>
+                <w:sz w:val="18"/>
+              </w:rPr>
               <w:t>4.12 or later</w:t>
             </w:r>
           </w:p>
@@ -127,6 +168,9 @@
           </w:tcPr>
           <w:p>
             <w:r>
+              <w:rPr>
+                <w:sz w:val="18"/>
+              </w:rPr>
               <w:t>User Workload Monitoring</w:t>
             </w:r>
           </w:p>
@@ -137,6 +181,9 @@
           </w:tcPr>
           <w:p>
             <w:r>
+              <w:rPr>
+                <w:sz w:val="18"/>
+              </w:rPr>
               <w:t>Enabled on the cluster</w:t>
             </w:r>
           </w:p>
@@ -149,6 +196,9 @@
           </w:tcPr>
           <w:p>
             <w:r>
+              <w:rPr>
+                <w:sz w:val="18"/>
+              </w:rPr>
               <w:t>Permissions</w:t>
             </w:r>
           </w:p>
@@ -159,6 +209,9 @@
           </w:tcPr>
           <w:p>
             <w:r>
+              <w:rPr>
+                <w:sz w:val="18"/>
+              </w:rPr>
               <w:t>cluster-admin or monitoring-edit role</w:t>
             </w:r>
           </w:p>
@@ -171,6 +224,9 @@
           </w:tcPr>
           <w:p>
             <w:r>
+              <w:rPr>
+                <w:sz w:val="18"/>
+              </w:rPr>
               <w:t>Network Egress</w:t>
             </w:r>
           </w:p>
@@ -181,6 +237,9 @@
           </w:tcPr>
           <w:p>
             <w:r>
+              <w:rPr>
+                <w:sz w:val="18"/>
+              </w:rPr>
               <w:t>HTTPS (443) to your LogicMonitor portal</w:t>
             </w:r>
           </w:p>
@@ -193,6 +252,9 @@
           </w:tcPr>
           <w:p>
             <w:r>
+              <w:rPr>
+                <w:sz w:val="18"/>
+              </w:rPr>
               <w:t>LM Logs</w:t>
             </w:r>
           </w:p>
@@ -203,6 +265,9 @@
           </w:tcPr>
           <w:p>
             <w:r>
+              <w:rPr>
+                <w:sz w:val="18"/>
+              </w:rPr>
               <w:t>Enabled on your LogicMonitor portal</w:t>
             </w:r>
           </w:p>
@@ -215,6 +280,9 @@
           </w:tcPr>
           <w:p>
             <w:r>
+              <w:rPr>
+                <w:sz w:val="18"/>
+              </w:rPr>
               <w:t>LM API User</w:t>
             </w:r>
           </w:p>
@@ -225,7 +293,10 @@
           </w:tcPr>
           <w:p>
             <w:r>
-              <w:t>Bearer token with log ingestion permissions</w:t>
+              <w:rPr>
+                <w:sz w:val="18"/>
+              </w:rPr>
+              <w:t>Bearer token with `lm_logs_administrator` role</w:t>
             </w:r>
           </w:p>
         </w:tc>
@@ -253,7 +324,16 @@
       </w:r>
     </w:p>
     <w:p>
+      <w:pPr>
+        <w:pStyle w:val="NoSpacing"/>
+        <w:spacing w:before="80" w:after="80"/>
+        <w:ind w:left="432"/>
+      </w:pPr>
       <w:r>
+        <w:rPr>
+          <w:rFonts w:ascii="Courier New" w:hAnsi="Courier New"/>
+          <w:sz w:val="16"/>
+        </w:rPr>
         <w:t>apiVersion: v1</w:t>
         <w:br/>
         <w:t>kind: ConfigMap</w:t>
@@ -276,11 +356,20 @@
         <w:pStyle w:val="Heading2"/>
       </w:pPr>
       <w:r>
-        <w:t>Step 1b: Enable AlertManager and AlertmanagerConfig</w:t>
+        <w:t>Step 1b: Enable AlertManager, AlertmanagerConfig, and External Labels</w:t>
       </w:r>
     </w:p>
     <w:p>
+      <w:pPr>
+        <w:pStyle w:val="NoSpacing"/>
+        <w:spacing w:before="80" w:after="80"/>
+        <w:ind w:left="432"/>
+      </w:pPr>
       <w:r>
+        <w:rPr>
+          <w:rFonts w:ascii="Courier New" w:hAnsi="Courier New"/>
+          <w:sz w:val="16"/>
+        </w:rPr>
         <w:t>apiVersion: v1</w:t>
         <w:br/>
         <w:t>kind: ConfigMap</w:t>
@@ -300,11 +389,96 @@
         <w:t xml:space="preserve">      enabled: true</w:t>
         <w:br/>
         <w:t xml:space="preserve">      enableAlertmanagerConfig: true</w:t>
+        <w:br/>
+        <w:t xml:space="preserve">    prometheus:</w:t>
+        <w:br/>
+        <w:t xml:space="preserve">      externalLabels:</w:t>
+        <w:br/>
+        <w:t xml:space="preserve">        cluster_name: &lt;your-cluster-name&gt;</w:t>
       </w:r>
     </w:p>
     <w:p>
       <w:r>
-        <w:t>Both enabled: true and enableAlertmanagerConfig: true are required. The first creates the AlertManager pods. The second tells the operator to reconcile AlertmanagerConfig CRDs from labeled namespaces. Without enableAlertmanagerConfig, AlertmanagerConfig resources are ignored.</w:t>
+        <w:t xml:space="preserve">Both </w:t>
+      </w:r>
+      <w:r>
+        <w:rPr>
+          <w:rFonts w:ascii="Courier New" w:hAnsi="Courier New"/>
+          <w:sz w:val="18"/>
+        </w:rPr>
+        <w:t>enabled: true</w:t>
+      </w:r>
+      <w:r>
+        <w:t xml:space="preserve"> and </w:t>
+      </w:r>
+      <w:r>
+        <w:rPr>
+          <w:rFonts w:ascii="Courier New" w:hAnsi="Courier New"/>
+          <w:sz w:val="18"/>
+        </w:rPr>
+        <w:t>enableAlertmanagerConfig: true</w:t>
+      </w:r>
+      <w:r>
+        <w:t xml:space="preserve"> are required. The first creates the AlertManager pods. The second tells the operator to reconcile AlertmanagerConfig CRDs from labeled namespaces. Without </w:t>
+      </w:r>
+      <w:r>
+        <w:rPr>
+          <w:rFonts w:ascii="Courier New" w:hAnsi="Courier New"/>
+          <w:sz w:val="18"/>
+        </w:rPr>
+        <w:t>enableAlertmanagerConfig</w:t>
+      </w:r>
+      <w:r>
+        <w:t>, AlertmanagerConfig resources are ignored.</w:t>
+      </w:r>
+    </w:p>
+    <w:p>
+      <w:r>
+        <w:t xml:space="preserve">The </w:t>
+      </w:r>
+      <w:r>
+        <w:rPr>
+          <w:rFonts w:ascii="Courier New" w:hAnsi="Courier New"/>
+          <w:sz w:val="18"/>
+        </w:rPr>
+        <w:t>cluster_name</w:t>
+      </w:r>
+      <w:r>
+        <w:t xml:space="preserve"> external label is injected into all alerts automatically. This is the recommended way to provide the cluster name for LogicMonitor resource identification, rather than adding it to every PrometheusRule individually.</w:t>
+      </w:r>
+    </w:p>
+    <w:p>
+      <w:pPr>
+        <w:pStyle w:val="Heading2"/>
+      </w:pPr>
+      <w:r>
+        <w:t>Verify</w:t>
+      </w:r>
+    </w:p>
+    <w:p>
+      <w:pPr>
+        <w:pStyle w:val="NoSpacing"/>
+        <w:spacing w:before="80" w:after="80"/>
+        <w:ind w:left="432"/>
+      </w:pPr>
+      <w:r>
+        <w:rPr>
+          <w:rFonts w:ascii="Courier New" w:hAnsi="Courier New"/>
+          <w:sz w:val="16"/>
+        </w:rPr>
+        <w:t># User workload monitoring namespace exists</w:t>
+        <w:br/>
+        <w:t>oc get namespace openshift-user-workload-monitoring</w:t>
+        <w:br/>
+        <w:br/>
+        <w:t># AlertManager pods are running</w:t>
+        <w:br/>
+        <w:t>oc get pods -n openshift-user-workload-monitoring -l app.kubernetes.io/name=alertmanager</w:t>
+      </w:r>
+    </w:p>
+    <w:p>
+      <w:r>
+        <w:t>Both should show Active/Running status.</w:t>
       </w:r>
     </w:p>
     <w:p>
@@ -336,7 +510,17 @@
         <w:pStyle w:val="ListNumber"/>
       </w:pPr>
       <w:r>
-        <w:t>Set username (e.g., openshift_alertmanager_webhook).</w:t>
+        <w:t xml:space="preserve">Set username (e.g., </w:t>
+      </w:r>
+      <w:r>
+        <w:rPr>
+          <w:rFonts w:ascii="Courier New" w:hAnsi="Courier New"/>
+          <w:sz w:val="18"/>
+        </w:rPr>
+        <w:t>openshift_alertmanager_webhook</w:t>
+      </w:r>
+      <w:r>
+        <w:t>).</w:t>
       </w:r>
     </w:p>
     <w:p>
@@ -344,7 +528,27 @@
         <w:pStyle w:val="ListNumber"/>
       </w:pPr>
       <w:r>
-        <w:t>Assign a role with LM Logs ingestion permissions (DataIngestion permission required).</w:t>
+        <w:t xml:space="preserve">Assign the </w:t>
+      </w:r>
+      <w:r>
+        <w:rPr>
+          <w:rFonts w:ascii="Courier New" w:hAnsi="Courier New"/>
+          <w:sz w:val="18"/>
+        </w:rPr>
+        <w:t>lm_logs_administrator</w:t>
+      </w:r>
+      <w:r>
+        <w:t xml:space="preserve"> role. The </w:t>
+      </w:r>
+      <w:r>
+        <w:rPr>
+          <w:rFonts w:ascii="Courier New" w:hAnsi="Courier New"/>
+          <w:sz w:val="18"/>
+        </w:rPr>
+        <w:t>manager</w:t>
+      </w:r>
+      <w:r>
+        <w:t xml:space="preserve"> role alone returns HTTP 202 but silently drops logs.</w:t>
       </w:r>
     </w:p>
     <w:p>
@@ -360,7 +564,17 @@
         <w:pStyle w:val="ListNumber"/>
       </w:pPr>
       <w:r>
-        <w:t>Copy the token (starts with lmb_). Store it securely.</w:t>
+        <w:t xml:space="preserve">Copy the token (starts with </w:t>
+      </w:r>
+      <w:r>
+        <w:rPr>
+          <w:rFonts w:ascii="Courier New" w:hAnsi="Courier New"/>
+          <w:sz w:val="18"/>
+        </w:rPr>
+        <w:t>lmb_</w:t>
+      </w:r>
+      <w:r>
+        <w:t>). Store it securely.</w:t>
       </w:r>
     </w:p>
     <w:p>
@@ -373,98 +587,76 @@
     </w:p>
     <w:p>
       <w:r>
-        <w:t>Navigate to Settings &gt; LM Logs &gt; Log Sources. Click Add Log Source.</w:t>
+        <w:t xml:space="preserve">Import the LogSource definition from </w:t>
+      </w:r>
+      <w:r>
+        <w:rPr>
+          <w:rFonts w:ascii="Courier New" w:hAnsi="Courier New"/>
+          <w:sz w:val="18"/>
+        </w:rPr>
+        <w:t>logsource/OpenShift_AlertManager_Webhook.json</w:t>
+      </w:r>
+      <w:r>
+        <w:t xml:space="preserve"> in the repository. This is the recommended approach to avoid manual configuration errors.</w:t>
+      </w:r>
+    </w:p>
+    <w:p>
+      <w:pPr>
+        <w:pStyle w:val="NoSpacing"/>
+        <w:spacing w:before="80" w:after="80"/>
+        <w:ind w:left="432"/>
+      </w:pPr>
+      <w:r>
+        <w:rPr>
+          <w:rFonts w:ascii="Courier New" w:hAnsi="Courier New"/>
+          <w:sz w:val="16"/>
+        </w:rPr>
+        <w:t>curl -X POST "https://&lt;portal&gt;.logicmonitor.com/santaba/rest/setting/logsources" \</w:t>
+        <w:br/>
+        <w:t xml:space="preserve">  -H "Authorization: Bearer &lt;your-token&gt;" \</w:t>
+        <w:br/>
+        <w:t xml:space="preserve">  -H "Content-Type: application/json" \</w:t>
+        <w:br/>
+        <w:t xml:space="preserve">  -d @logsource/OpenShift_AlertManager_Webhook.json</w:t>
       </w:r>
     </w:p>
     <w:p>
       <w:r>
-        <w:t>Configure: Name: OpenShift_AlertManager_Webhook, Group: OpenShift, Type: Webhook, Authentication: Bearer Token.</w:t>
+        <w:t>Alternatively, create it manually in the portal (Settings &gt; LM Logs &gt; Log Sources &gt; Add):</w:t>
       </w:r>
     </w:p>
     <w:p>
       <w:pPr>
-        <w:pStyle w:val="Heading2"/>
+        <w:pStyle w:val="ListBullet"/>
       </w:pPr>
       <w:r>
-        <w:t>Source Filter</w:t>
+        <w:t xml:space="preserve">Name: </w:t>
+      </w:r>
+      <w:r>
+        <w:rPr>
+          <w:rFonts w:ascii="Courier New" w:hAnsi="Courier New"/>
+          <w:sz w:val="18"/>
+        </w:rPr>
+        <w:t>OpenShift_AlertManager_Webhook</w:t>
+      </w:r>
+      <w:r/>
+    </w:p>
+    <w:p>
+      <w:pPr>
+        <w:pStyle w:val="ListBullet"/>
+      </w:pPr>
+      <w:r>
+        <w:t>Type: Webhook</w:t>
       </w:r>
     </w:p>
-    <w:tbl>
-      <w:tblPr>
-        <w:tblStyle w:val="LightList-Accent1"/>
-        <w:tblW w:type="auto" w:w="0"/>
-        <w:tblLook w:firstColumn="1" w:firstRow="1" w:lastColumn="0" w:lastRow="0" w:noHBand="0" w:noVBand="1" w:val="04A0"/>
-      </w:tblPr>
-      <w:tblGrid>
-        <w:gridCol w:w="2880"/>
-        <w:gridCol w:w="2880"/>
-        <w:gridCol w:w="2880"/>
-      </w:tblGrid>
-      <w:tr>
-        <w:tc>
-          <w:tcPr>
-            <w:tcW w:type="dxa" w:w="2880"/>
-          </w:tcPr>
-          <w:p>
-            <w:r>
-              <w:t>Attribute</w:t>
-            </w:r>
-          </w:p>
-        </w:tc>
-        <w:tc>
-          <w:tcPr>
-            <w:tcW w:type="dxa" w:w="2880"/>
-          </w:tcPr>
-          <w:p>
-            <w:r>
-              <w:t>Operator</w:t>
-            </w:r>
-          </w:p>
-        </w:tc>
-        <w:tc>
-          <w:tcPr>
-            <w:tcW w:type="dxa" w:w="2880"/>
-          </w:tcPr>
-          <w:p>
-            <w:r>
-              <w:t>Value</w:t>
-            </w:r>
-          </w:p>
-        </w:tc>
-      </w:tr>
-      <w:tr>
-        <w:tc>
-          <w:tcPr>
-            <w:tcW w:type="dxa" w:w="2880"/>
-          </w:tcPr>
-          <w:p>
-            <w:r>
-              <w:t>SourceName</w:t>
-            </w:r>
-          </w:p>
-        </w:tc>
-        <w:tc>
-          <w:tcPr>
-            <w:tcW w:type="dxa" w:w="2880"/>
-          </w:tcPr>
-          <w:p>
-            <w:r>
-              <w:t>Equal</w:t>
-            </w:r>
-          </w:p>
-        </w:tc>
-        <w:tc>
-          <w:tcPr>
-            <w:tcW w:type="dxa" w:w="2880"/>
-          </w:tcPr>
-          <w:p>
-            <w:r>
-              <w:t>openshift_alertmanager</w:t>
-            </w:r>
-          </w:p>
-        </w:tc>
-      </w:tr>
-    </w:tbl>
+    <w:p>
+      <w:pPr>
+        <w:pStyle w:val="ListBullet"/>
+      </w:pPr>
+      <w:r>
+        <w:t>Filters: None (do not add a SourceName filter)</w:t>
+      </w:r>
+    </w:p>
     <w:p>
       <w:pPr>
         <w:pStyle w:val="Heading2"/>
@@ -473,9 +665,14 @@
         <w:t>Field Extraction</w:t>
       </w:r>
     </w:p>
+    <w:p>
+      <w:r>
+        <w:t>The LogSource uses two extraction methods for reliability. WebhookAttribute uses JSONPath to access structured fields. RegexGroup uses regex on the raw payload body as a fallback.</w:t>
+      </w:r>
+    </w:p>
     <w:tbl>
       <w:tblPr>
-        <w:tblStyle w:val="LightList-Accent1"/>
+        <w:tblStyle w:val="LightGrid-Accent1"/>
         <w:tblW w:type="auto" w:w="0"/>
         <w:tblLook w:firstColumn="1" w:firstRow="1" w:lastColumn="0" w:lastRow="0" w:noHBand="0" w:noVBand="1" w:val="04A0"/>
       </w:tblPr>
@@ -492,6 +689,10 @@
           </w:tcPr>
           <w:p>
             <w:r>
+              <w:rPr>
+                <w:b/>
+                <w:sz w:val="18"/>
+              </w:rPr>
               <w:t>Field Name</w:t>
             </w:r>
           </w:p>
@@ -502,6 +703,10 @@
           </w:tcPr>
           <w:p>
             <w:r>
+              <w:rPr>
+                <w:b/>
+                <w:sz w:val="18"/>
+              </w:rPr>
               <w:t>Method</w:t>
             </w:r>
           </w:p>
@@ -512,6 +717,10 @@
           </w:tcPr>
           <w:p>
             <w:r>
+              <w:rPr>
+                <w:b/>
+                <w:sz w:val="18"/>
+              </w:rPr>
               <w:t>Value</w:t>
             </w:r>
           </w:p>
@@ -522,6 +731,10 @@
           </w:tcPr>
           <w:p>
             <w:r>
+              <w:rPr>
+                <w:b/>
+                <w:sz w:val="18"/>
+              </w:rPr>
               <w:t>Description</w:t>
             </w:r>
           </w:p>
@@ -534,6 +747,9 @@
           </w:tcPr>
           <w:p>
             <w:r>
+              <w:rPr>
+                <w:sz w:val="18"/>
+              </w:rPr>
               <w:t>status</w:t>
             </w:r>
           </w:p>
@@ -544,6 +760,9 @@
           </w:tcPr>
           <w:p>
             <w:r>
+              <w:rPr>
+                <w:sz w:val="18"/>
+              </w:rPr>
               <w:t>WebhookAttribute</w:t>
             </w:r>
           </w:p>
@@ -554,7 +773,10 @@
           </w:tcPr>
           <w:p>
             <w:r>
-              <w:t>status</w:t>
+              <w:rPr>
+                <w:sz w:val="18"/>
+              </w:rPr>
+              <w:t>$.status</w:t>
             </w:r>
           </w:p>
         </w:tc>
@@ -564,6 +786,9 @@
           </w:tcPr>
           <w:p>
             <w:r>
+              <w:rPr>
+                <w:sz w:val="18"/>
+              </w:rPr>
               <w:t>Alert state (firing/resolved)</w:t>
             </w:r>
           </w:p>
@@ -576,6 +801,63 @@
           </w:tcPr>
           <w:p>
             <w:r>
+              <w:rPr>
+                <w:sz w:val="18"/>
+              </w:rPr>
+              <w:t>receiver</w:t>
+            </w:r>
+          </w:p>
+        </w:tc>
+        <w:tc>
+          <w:tcPr>
+            <w:tcW w:type="dxa" w:w="2160"/>
+          </w:tcPr>
+          <w:p>
+            <w:r>
+              <w:rPr>
+                <w:sz w:val="18"/>
+              </w:rPr>
+              <w:t>WebhookAttribute</w:t>
+            </w:r>
+          </w:p>
+        </w:tc>
+        <w:tc>
+          <w:tcPr>
+            <w:tcW w:type="dxa" w:w="2160"/>
+          </w:tcPr>
+          <w:p>
+            <w:r>
+              <w:rPr>
+                <w:sz w:val="18"/>
+              </w:rPr>
+              <w:t>$.receiver</w:t>
+            </w:r>
+          </w:p>
+        </w:tc>
+        <w:tc>
+          <w:tcPr>
+            <w:tcW w:type="dxa" w:w="2160"/>
+          </w:tcPr>
+          <w:p>
+            <w:r>
+              <w:rPr>
+                <w:sz w:val="18"/>
+              </w:rPr>
+              <w:t>AlertManager receiver name</w:t>
+            </w:r>
+          </w:p>
+        </w:tc>
+      </w:tr>
+      <w:tr>
+        <w:tc>
+          <w:tcPr>
+            <w:tcW w:type="dxa" w:w="2160"/>
+          </w:tcPr>
+          <w:p>
+            <w:r>
+              <w:rPr>
+                <w:sz w:val="18"/>
+              </w:rPr>
               <w:t>alertname</w:t>
             </w:r>
           </w:p>
@@ -586,7 +868,10 @@
           </w:tcPr>
           <w:p>
             <w:r>
-              <w:t>Regex</w:t>
+              <w:rPr>
+                <w:sz w:val="18"/>
+              </w:rPr>
+              <w:t>WebhookAttribute</w:t>
             </w:r>
           </w:p>
         </w:tc>
@@ -596,7 +881,10 @@
           </w:tcPr>
           <w:p>
             <w:r>
-              <w:t>"alertname":"([^"]+)"</w:t>
+              <w:rPr>
+                <w:sz w:val="18"/>
+              </w:rPr>
+              <w:t>$.alerts[*].labels.alertname</w:t>
             </w:r>
           </w:p>
         </w:tc>
@@ -606,6 +894,9 @@
           </w:tcPr>
           <w:p>
             <w:r>
+              <w:rPr>
+                <w:sz w:val="18"/>
+              </w:rPr>
               <w:t>Name of the alert</w:t>
             </w:r>
           </w:p>
@@ -618,6 +909,9 @@
           </w:tcPr>
           <w:p>
             <w:r>
+              <w:rPr>
+                <w:sz w:val="18"/>
+              </w:rPr>
               <w:t>namespace</w:t>
             </w:r>
           </w:p>
@@ -628,7 +922,10 @@
           </w:tcPr>
           <w:p>
             <w:r>
-              <w:t>Regex</w:t>
+              <w:rPr>
+                <w:sz w:val="18"/>
+              </w:rPr>
+              <w:t>WebhookAttribute</w:t>
             </w:r>
           </w:p>
         </w:tc>
@@ -638,7 +935,10 @@
           </w:tcPr>
           <w:p>
             <w:r>
-              <w:t>"namespace":"([^"]+)"</w:t>
+              <w:rPr>
+                <w:sz w:val="18"/>
+              </w:rPr>
+              <w:t>$.alerts[*].labels.namespace</w:t>
             </w:r>
           </w:p>
         </w:tc>
@@ -648,6 +948,9 @@
           </w:tcPr>
           <w:p>
             <w:r>
+              <w:rPr>
+                <w:sz w:val="18"/>
+              </w:rPr>
               <w:t>Kubernetes namespace</w:t>
             </w:r>
           </w:p>
@@ -660,6 +963,9 @@
           </w:tcPr>
           <w:p>
             <w:r>
+              <w:rPr>
+                <w:sz w:val="18"/>
+              </w:rPr>
               <w:t>severity</w:t>
             </w:r>
           </w:p>
@@ -670,7 +976,10 @@
           </w:tcPr>
           <w:p>
             <w:r>
-              <w:t>Regex</w:t>
+              <w:rPr>
+                <w:sz w:val="18"/>
+              </w:rPr>
+              <w:t>WebhookAttribute</w:t>
             </w:r>
           </w:p>
         </w:tc>
@@ -680,7 +989,10 @@
           </w:tcPr>
           <w:p>
             <w:r>
-              <w:t>"severity":"([^"]+)"</w:t>
+              <w:rPr>
+                <w:sz w:val="18"/>
+              </w:rPr>
+              <w:t>$.alerts[*].labels.severity</w:t>
             </w:r>
           </w:p>
         </w:tc>
@@ -690,6 +1002,9 @@
           </w:tcPr>
           <w:p>
             <w:r>
+              <w:rPr>
+                <w:sz w:val="18"/>
+              </w:rPr>
               <w:t>Alert severity level</w:t>
             </w:r>
           </w:p>
@@ -702,7 +1017,10 @@
           </w:tcPr>
           <w:p>
             <w:r>
-              <w:t>cluster_name</w:t>
+              <w:rPr>
+                <w:sz w:val="18"/>
+              </w:rPr>
+              <w:t>summary</w:t>
             </w:r>
           </w:p>
         </w:tc>
@@ -712,7 +1030,10 @@
           </w:tcPr>
           <w:p>
             <w:r>
-              <w:t>Regex</w:t>
+              <w:rPr>
+                <w:sz w:val="18"/>
+              </w:rPr>
+              <w:t>WebhookAttribute</w:t>
             </w:r>
           </w:p>
         </w:tc>
@@ -722,7 +1043,10 @@
           </w:tcPr>
           <w:p>
             <w:r>
-              <w:t>"cluster_name":"([^"]+)"</w:t>
+              <w:rPr>
+                <w:sz w:val="18"/>
+              </w:rPr>
+              <w:t>$.alerts[*].annotations.summary</w:t>
             </w:r>
           </w:p>
         </w:tc>
@@ -732,7 +1056,10 @@
           </w:tcPr>
           <w:p>
             <w:r>
-              <w:t>Cluster identifier</w:t>
+              <w:rPr>
+                <w:sz w:val="18"/>
+              </w:rPr>
+              <w:t>Alert summary</w:t>
             </w:r>
           </w:p>
         </w:tc>
@@ -744,7 +1071,10 @@
           </w:tcPr>
           <w:p>
             <w:r>
-              <w:t>receiver</w:t>
+              <w:rPr>
+                <w:sz w:val="18"/>
+              </w:rPr>
+              <w:t>nodename</w:t>
             </w:r>
           </w:p>
         </w:tc>
@@ -754,6 +1084,9 @@
           </w:tcPr>
           <w:p>
             <w:r>
+              <w:rPr>
+                <w:sz w:val="18"/>
+              </w:rPr>
               <w:t>WebhookAttribute</w:t>
             </w:r>
           </w:p>
@@ -764,7 +1097,10 @@
           </w:tcPr>
           <w:p>
             <w:r>
-              <w:t>receiver</w:t>
+              <w:rPr>
+                <w:sz w:val="18"/>
+              </w:rPr>
+              <w:t>$.alerts[*].labels.instance_name</w:t>
             </w:r>
           </w:p>
         </w:tc>
@@ -774,7 +1110,10 @@
           </w:tcPr>
           <w:p>
             <w:r>
-              <w:t>AlertManager receiver name</w:t>
+              <w:rPr>
+                <w:sz w:val="18"/>
+              </w:rPr>
+              <w:t>Node or instance name</w:t>
             </w:r>
           </w:p>
         </w:tc>
@@ -786,7 +1125,10 @@
           </w:tcPr>
           <w:p>
             <w:r>
-              <w:t>instance</w:t>
+              <w:rPr>
+                <w:sz w:val="18"/>
+              </w:rPr>
+              <w:t>a_alertname</w:t>
             </w:r>
           </w:p>
         </w:tc>
@@ -796,7 +1138,10 @@
           </w:tcPr>
           <w:p>
             <w:r>
-              <w:t>Regex</w:t>
+              <w:rPr>
+                <w:sz w:val="18"/>
+              </w:rPr>
+              <w:t>RegexGroup</w:t>
             </w:r>
           </w:p>
         </w:tc>
@@ -806,7 +1151,10 @@
           </w:tcPr>
           <w:p>
             <w:r>
-              <w:t>"instance":"([^"]+)"</w:t>
+              <w:rPr>
+                <w:sz w:val="18"/>
+              </w:rPr>
+              <w:t>"alertname"\s*:\s*"([^"]+)"</w:t>
             </w:r>
           </w:p>
         </w:tc>
@@ -816,7 +1164,10 @@
           </w:tcPr>
           <w:p>
             <w:r>
-              <w:t>Alert instance</w:t>
+              <w:rPr>
+                <w:sz w:val="18"/>
+              </w:rPr>
+              <w:t>Alert name (regex fallback)</w:t>
             </w:r>
           </w:p>
         </w:tc>
@@ -828,7 +1179,10 @@
           </w:tcPr>
           <w:p>
             <w:r>
-              <w:t>source_type</w:t>
+              <w:rPr>
+                <w:sz w:val="18"/>
+              </w:rPr>
+              <w:t>a_severity</w:t>
             </w:r>
           </w:p>
         </w:tc>
@@ -838,7 +1192,10 @@
           </w:tcPr>
           <w:p>
             <w:r>
-              <w:t>Static</w:t>
+              <w:rPr>
+                <w:sz w:val="18"/>
+              </w:rPr>
+              <w:t>RegexGroup</w:t>
             </w:r>
           </w:p>
         </w:tc>
@@ -848,7 +1205,10 @@
           </w:tcPr>
           <w:p>
             <w:r>
-              <w:t>prometheus_alertmanager</w:t>
+              <w:rPr>
+                <w:sz w:val="18"/>
+              </w:rPr>
+              <w:t>"severity"\s*:\s*"([^"]+)"</w:t>
             </w:r>
           </w:p>
         </w:tc>
@@ -858,7 +1218,280 @@
           </w:tcPr>
           <w:p>
             <w:r>
-              <w:t>Source identifier</w:t>
+              <w:rPr>
+                <w:sz w:val="18"/>
+              </w:rPr>
+              <w:t>Severity (regex fallback)</w:t>
+            </w:r>
+          </w:p>
+        </w:tc>
+      </w:tr>
+      <w:tr>
+        <w:tc>
+          <w:tcPr>
+            <w:tcW w:type="dxa" w:w="2160"/>
+          </w:tcPr>
+          <w:p>
+            <w:r>
+              <w:rPr>
+                <w:sz w:val="18"/>
+              </w:rPr>
+              <w:t>a_summary</w:t>
+            </w:r>
+          </w:p>
+        </w:tc>
+        <w:tc>
+          <w:tcPr>
+            <w:tcW w:type="dxa" w:w="2160"/>
+          </w:tcPr>
+          <w:p>
+            <w:r>
+              <w:rPr>
+                <w:sz w:val="18"/>
+              </w:rPr>
+              <w:t>RegexGroup</w:t>
+            </w:r>
+          </w:p>
+        </w:tc>
+        <w:tc>
+          <w:tcPr>
+            <w:tcW w:type="dxa" w:w="2160"/>
+          </w:tcPr>
+          <w:p>
+            <w:r>
+              <w:rPr>
+                <w:sz w:val="18"/>
+              </w:rPr>
+              <w:t>"summary"\s*:\s*"([^"]+)"</w:t>
+            </w:r>
+          </w:p>
+        </w:tc>
+        <w:tc>
+          <w:tcPr>
+            <w:tcW w:type="dxa" w:w="2160"/>
+          </w:tcPr>
+          <w:p>
+            <w:r>
+              <w:rPr>
+                <w:sz w:val="18"/>
+              </w:rPr>
+              <w:t>Summary (regex fallback)</w:t>
+            </w:r>
+          </w:p>
+        </w:tc>
+      </w:tr>
+      <w:tr>
+        <w:tc>
+          <w:tcPr>
+            <w:tcW w:type="dxa" w:w="2160"/>
+          </w:tcPr>
+          <w:p>
+            <w:r>
+              <w:rPr>
+                <w:sz w:val="18"/>
+              </w:rPr>
+              <w:t>a_description</w:t>
+            </w:r>
+          </w:p>
+        </w:tc>
+        <w:tc>
+          <w:tcPr>
+            <w:tcW w:type="dxa" w:w="2160"/>
+          </w:tcPr>
+          <w:p>
+            <w:r>
+              <w:rPr>
+                <w:sz w:val="18"/>
+              </w:rPr>
+              <w:t>RegexGroup</w:t>
+            </w:r>
+          </w:p>
+        </w:tc>
+        <w:tc>
+          <w:tcPr>
+            <w:tcW w:type="dxa" w:w="2160"/>
+          </w:tcPr>
+          <w:p>
+            <w:r>
+              <w:rPr>
+                <w:sz w:val="18"/>
+              </w:rPr>
+              <w:t>"description"\s*:\s*"((?:[^"\\]</w:t>
+            </w:r>
+          </w:p>
+        </w:tc>
+        <w:tc>
+          <w:tcPr>
+            <w:tcW w:type="dxa" w:w="2160"/>
+          </w:tcPr>
+          <w:p>
+            <w:r>
+              <w:rPr>
+                <w:sz w:val="18"/>
+              </w:rPr>
+              <w:t>\\.)*)"</w:t>
+            </w:r>
+          </w:p>
+        </w:tc>
+      </w:tr>
+      <w:tr>
+        <w:tc>
+          <w:tcPr>
+            <w:tcW w:type="dxa" w:w="2160"/>
+          </w:tcPr>
+          <w:p>
+            <w:r>
+              <w:rPr>
+                <w:sz w:val="18"/>
+              </w:rPr>
+              <w:t>a_pod</w:t>
+            </w:r>
+          </w:p>
+        </w:tc>
+        <w:tc>
+          <w:tcPr>
+            <w:tcW w:type="dxa" w:w="2160"/>
+          </w:tcPr>
+          <w:p>
+            <w:r>
+              <w:rPr>
+                <w:sz w:val="18"/>
+              </w:rPr>
+              <w:t>RegexGroup</w:t>
+            </w:r>
+          </w:p>
+        </w:tc>
+        <w:tc>
+          <w:tcPr>
+            <w:tcW w:type="dxa" w:w="2160"/>
+          </w:tcPr>
+          <w:p>
+            <w:r>
+              <w:rPr>
+                <w:sz w:val="18"/>
+              </w:rPr>
+              <w:t>"pod"\s*:\s*"([^"]+)"</w:t>
+            </w:r>
+          </w:p>
+        </w:tc>
+        <w:tc>
+          <w:tcPr>
+            <w:tcW w:type="dxa" w:w="2160"/>
+          </w:tcPr>
+          <w:p>
+            <w:r>
+              <w:rPr>
+                <w:sz w:val="18"/>
+              </w:rPr>
+              <w:t>Pod name</w:t>
+            </w:r>
+          </w:p>
+        </w:tc>
+      </w:tr>
+      <w:tr>
+        <w:tc>
+          <w:tcPr>
+            <w:tcW w:type="dxa" w:w="2160"/>
+          </w:tcPr>
+          <w:p>
+            <w:r>
+              <w:rPr>
+                <w:sz w:val="18"/>
+              </w:rPr>
+              <w:t>a_nodename</w:t>
+            </w:r>
+          </w:p>
+        </w:tc>
+        <w:tc>
+          <w:tcPr>
+            <w:tcW w:type="dxa" w:w="2160"/>
+          </w:tcPr>
+          <w:p>
+            <w:r>
+              <w:rPr>
+                <w:sz w:val="18"/>
+              </w:rPr>
+              <w:t>RegexGroup</w:t>
+            </w:r>
+          </w:p>
+        </w:tc>
+        <w:tc>
+          <w:tcPr>
+            <w:tcW w:type="dxa" w:w="2160"/>
+          </w:tcPr>
+          <w:p>
+            <w:r>
+              <w:rPr>
+                <w:sz w:val="18"/>
+              </w:rPr>
+              <w:t>"instance_name"\s*:\s*"([^"]+)"</w:t>
+            </w:r>
+          </w:p>
+        </w:tc>
+        <w:tc>
+          <w:tcPr>
+            <w:tcW w:type="dxa" w:w="2160"/>
+          </w:tcPr>
+          <w:p>
+            <w:r>
+              <w:rPr>
+                <w:sz w:val="18"/>
+              </w:rPr>
+              <w:t>Instance name (regex fallback)</w:t>
+            </w:r>
+          </w:p>
+        </w:tc>
+      </w:tr>
+      <w:tr>
+        <w:tc>
+          <w:tcPr>
+            <w:tcW w:type="dxa" w:w="2160"/>
+          </w:tcPr>
+          <w:p>
+            <w:r>
+              <w:rPr>
+                <w:sz w:val="18"/>
+              </w:rPr>
+              <w:t>a_genURL</w:t>
+            </w:r>
+          </w:p>
+        </w:tc>
+        <w:tc>
+          <w:tcPr>
+            <w:tcW w:type="dxa" w:w="2160"/>
+          </w:tcPr>
+          <w:p>
+            <w:r>
+              <w:rPr>
+                <w:sz w:val="18"/>
+              </w:rPr>
+              <w:t>RegexGroup</w:t>
+            </w:r>
+          </w:p>
+        </w:tc>
+        <w:tc>
+          <w:tcPr>
+            <w:tcW w:type="dxa" w:w="2160"/>
+          </w:tcPr>
+          <w:p>
+            <w:r>
+              <w:rPr>
+                <w:sz w:val="18"/>
+              </w:rPr>
+              <w:t>"generatorURL"\s*:\s*"((?:[^"\\]</w:t>
+            </w:r>
+          </w:p>
+        </w:tc>
+        <w:tc>
+          <w:tcPr>
+            <w:tcW w:type="dxa" w:w="2160"/>
+          </w:tcPr>
+          <w:p>
+            <w:r>
+              <w:rPr>
+                <w:sz w:val="18"/>
+              </w:rPr>
+              <w:t>\\.)*)"</w:t>
             </w:r>
           </w:p>
         </w:tc>
@@ -872,45 +1505,87 @@
         <w:t>Resource Mapping</w:t>
       </w:r>
     </w:p>
+    <w:p>
+      <w:r>
+        <w:t xml:space="preserve">Resource mapping extracts attributes stored on each log entry in </w:t>
+      </w:r>
+      <w:r>
+        <w:rPr>
+          <w:rFonts w:ascii="Courier New" w:hAnsi="Courier New"/>
+          <w:sz w:val="18"/>
+        </w:rPr>
+        <w:t>_resource.attributes</w:t>
+      </w:r>
+      <w:r>
+        <w:t>. These are metadata fields for querying and identification. Webhook-based logs do not populate the Resource or Resource Type columns in LM Logs (this is a platform limitation for webhook ingestion).</w:t>
+      </w:r>
+    </w:p>
     <w:tbl>
       <w:tblPr>
-        <w:tblStyle w:val="LightList-Accent1"/>
+        <w:tblStyle w:val="LightGrid-Accent1"/>
         <w:tblW w:type="auto" w:w="0"/>
         <w:tblLook w:firstColumn="1" w:firstRow="1" w:lastColumn="0" w:lastRow="0" w:noHBand="0" w:noVBand="1" w:val="04A0"/>
       </w:tblPr>
       <w:tblGrid>
-        <w:gridCol w:w="2880"/>
-        <w:gridCol w:w="2880"/>
-        <w:gridCol w:w="2880"/>
+        <w:gridCol w:w="2160"/>
+        <w:gridCol w:w="2160"/>
+        <w:gridCol w:w="2160"/>
+        <w:gridCol w:w="2160"/>
       </w:tblGrid>
       <w:tr>
         <w:tc>
           <w:tcPr>
-            <w:tcW w:type="dxa" w:w="2880"/>
+            <w:tcW w:type="dxa" w:w="2160"/>
           </w:tcPr>
           <w:p>
             <w:r>
+              <w:rPr>
+                <w:b/>
+                <w:sz w:val="18"/>
+              </w:rPr>
               <w:t>Method</w:t>
             </w:r>
           </w:p>
         </w:tc>
         <w:tc>
           <w:tcPr>
-            <w:tcW w:type="dxa" w:w="2880"/>
+            <w:tcW w:type="dxa" w:w="2160"/>
           </w:tcPr>
           <w:p>
             <w:r>
+              <w:rPr>
+                <w:b/>
+                <w:sz w:val="18"/>
+              </w:rPr>
               <w:t>Key</w:t>
             </w:r>
           </w:p>
         </w:tc>
         <w:tc>
           <w:tcPr>
-            <w:tcW w:type="dxa" w:w="2880"/>
+            <w:tcW w:type="dxa" w:w="2160"/>
           </w:tcPr>
           <w:p>
             <w:r>
+              <w:rPr>
+                <w:b/>
+                <w:sz w:val="18"/>
+              </w:rPr>
               <w:t>Value</w:t>
+            </w:r>
+          </w:p>
+        </w:tc>
+        <w:tc>
+          <w:tcPr>
+            <w:tcW w:type="dxa" w:w="2160"/>
+          </w:tcPr>
+          <w:p>
+            <w:r>
+              <w:rPr>
+                <w:b/>
+                <w:sz w:val="18"/>
+              </w:rPr>
+              <w:t>Purpose</w:t>
             </w:r>
           </w:p>
         </w:tc>
@@ -918,41 +1593,166 @@
       <w:tr>
         <w:tc>
           <w:tcPr>
-            <w:tcW w:type="dxa" w:w="2880"/>
+            <w:tcW w:type="dxa" w:w="2160"/>
           </w:tcPr>
           <w:p>
             <w:r>
-              <w:t>Dynamic Group Regex</w:t>
+              <w:rPr>
+                <w:sz w:val="18"/>
+              </w:rPr>
+              <w:t>RegexGroup</w:t>
             </w:r>
           </w:p>
         </w:tc>
         <w:tc>
           <w:tcPr>
-            <w:tcW w:type="dxa" w:w="2880"/>
+            <w:tcW w:type="dxa" w:w="2160"/>
           </w:tcPr>
           <w:p>
             <w:r>
+              <w:rPr>
+                <w:sz w:val="18"/>
+              </w:rPr>
+              <w:t>openshift.instance.name</w:t>
+            </w:r>
+          </w:p>
+        </w:tc>
+        <w:tc>
+          <w:tcPr>
+            <w:tcW w:type="dxa" w:w="2160"/>
+          </w:tcPr>
+          <w:p>
+            <w:r>
+              <w:rPr>
+                <w:sz w:val="18"/>
+              </w:rPr>
+              <w:t>"instance_name"\s*:\s*"([^"]+)"</w:t>
+            </w:r>
+          </w:p>
+        </w:tc>
+        <w:tc>
+          <w:tcPr>
+            <w:tcW w:type="dxa" w:w="2160"/>
+          </w:tcPr>
+          <w:p>
+            <w:r>
+              <w:rPr>
+                <w:sz w:val="18"/>
+              </w:rPr>
+              <w:t>Instance name attribute</w:t>
+            </w:r>
+          </w:p>
+        </w:tc>
+      </w:tr>
+      <w:tr>
+        <w:tc>
+          <w:tcPr>
+            <w:tcW w:type="dxa" w:w="2160"/>
+          </w:tcPr>
+          <w:p>
+            <w:r>
+              <w:rPr>
+                <w:sz w:val="18"/>
+              </w:rPr>
+              <w:t>RegexGroup</w:t>
+            </w:r>
+          </w:p>
+        </w:tc>
+        <w:tc>
+          <w:tcPr>
+            <w:tcW w:type="dxa" w:w="2160"/>
+          </w:tcPr>
+          <w:p>
+            <w:r>
+              <w:rPr>
+                <w:sz w:val="18"/>
+              </w:rPr>
+              <w:t>openshift.alert.name</w:t>
+            </w:r>
+          </w:p>
+        </w:tc>
+        <w:tc>
+          <w:tcPr>
+            <w:tcW w:type="dxa" w:w="2160"/>
+          </w:tcPr>
+          <w:p>
+            <w:r>
+              <w:rPr>
+                <w:sz w:val="18"/>
+              </w:rPr>
+              <w:t>"alertname"\s*:\s*"([^"]+)"</w:t>
+            </w:r>
+          </w:p>
+        </w:tc>
+        <w:tc>
+          <w:tcPr>
+            <w:tcW w:type="dxa" w:w="2160"/>
+          </w:tcPr>
+          <w:p>
+            <w:r>
+              <w:rPr>
+                <w:sz w:val="18"/>
+              </w:rPr>
+              <w:t>Alert name attribute</w:t>
+            </w:r>
+          </w:p>
+        </w:tc>
+      </w:tr>
+      <w:tr>
+        <w:tc>
+          <w:tcPr>
+            <w:tcW w:type="dxa" w:w="2160"/>
+          </w:tcPr>
+          <w:p>
+            <w:r>
+              <w:rPr>
+                <w:sz w:val="18"/>
+              </w:rPr>
+              <w:t>RegexGroup</w:t>
+            </w:r>
+          </w:p>
+        </w:tc>
+        <w:tc>
+          <w:tcPr>
+            <w:tcW w:type="dxa" w:w="2160"/>
+          </w:tcPr>
+          <w:p>
+            <w:r>
+              <w:rPr>
+                <w:sz w:val="18"/>
+              </w:rPr>
               <w:t>openshift.cluster.name</w:t>
             </w:r>
           </w:p>
         </w:tc>
         <w:tc>
           <w:tcPr>
-            <w:tcW w:type="dxa" w:w="2880"/>
+            <w:tcW w:type="dxa" w:w="2160"/>
           </w:tcPr>
           <w:p>
             <w:r>
+              <w:rPr>
+                <w:sz w:val="18"/>
+              </w:rPr>
               <w:t>"cluster_name"\s*:\s*"([^"]+)"</w:t>
+            </w:r>
+          </w:p>
+        </w:tc>
+        <w:tc>
+          <w:tcPr>
+            <w:tcW w:type="dxa" w:w="2160"/>
+          </w:tcPr>
+          <w:p>
+            <w:r>
+              <w:rPr>
+                <w:sz w:val="18"/>
+              </w:rPr>
+              <w:t>Cluster name attribute</w:t>
             </w:r>
           </w:p>
         </w:tc>
       </w:tr>
     </w:tbl>
-    <w:p>
-      <w:r>
-        <w:t>This regex extracts the cluster name from the JSON payload and matches it against resources where the property openshift.cluster.name equals the extracted value.</w:t>
-      </w:r>
-    </w:p>
     <w:p>
       <w:pPr>
         <w:pStyle w:val="Heading1"/>
@@ -963,7 +1763,64 @@
     </w:p>
     <w:p>
       <w:r>
-        <w:t>For each monitored cluster, navigate to Resources, find the Kubernetes cluster resource, go to Info tab &gt; Properties, and add a custom property: Name: openshift.cluster.name, Value: your cluster name.</w:t>
+        <w:t>For each monitored cluster:</w:t>
+      </w:r>
+    </w:p>
+    <w:p>
+      <w:pPr>
+        <w:pStyle w:val="ListNumber"/>
+      </w:pPr>
+      <w:r>
+        <w:t>Navigate to Resources and find your Kubernetes cluster resource.</w:t>
+      </w:r>
+    </w:p>
+    <w:p>
+      <w:pPr>
+        <w:pStyle w:val="ListNumber"/>
+      </w:pPr>
+      <w:r>
+        <w:t>Go to Info tab &gt; Properties.</w:t>
+      </w:r>
+    </w:p>
+    <w:p>
+      <w:pPr>
+        <w:pStyle w:val="ListNumber"/>
+      </w:pPr>
+      <w:r>
+        <w:t>Click Add &gt; Add Custom Property.</w:t>
+      </w:r>
+    </w:p>
+    <w:p>
+      <w:pPr>
+        <w:pStyle w:val="ListNumber"/>
+      </w:pPr>
+      <w:r>
+        <w:t xml:space="preserve">Set Name: </w:t>
+      </w:r>
+      <w:r>
+        <w:rPr>
+          <w:rFonts w:ascii="Courier New" w:hAnsi="Courier New"/>
+          <w:sz w:val="18"/>
+        </w:rPr>
+        <w:t>openshift.cluster.name</w:t>
+      </w:r>
+      <w:r>
+        <w:t>, Value: your cluster name.</w:t>
+      </w:r>
+    </w:p>
+    <w:p>
+      <w:r>
+        <w:t xml:space="preserve">The cluster name must match the </w:t>
+      </w:r>
+      <w:r>
+        <w:rPr>
+          <w:rFonts w:ascii="Courier New" w:hAnsi="Courier New"/>
+          <w:sz w:val="18"/>
+        </w:rPr>
+        <w:t>cluster_name</w:t>
+      </w:r>
+      <w:r>
+        <w:t xml:space="preserve"> label used in your PrometheusRule definitions.</w:t>
       </w:r>
     </w:p>
     <w:p>
@@ -976,7 +1833,27 @@
     </w:p>
     <w:p>
       <w:r>
-        <w:t>oc label namespace &lt;namespace&gt; openshift.io/cluster-monitoring=false openshift.io/user-monitoring=true --overwrite</w:t>
+        <w:t>Label the namespace where you will deploy the AlertmanagerConfig:</w:t>
+      </w:r>
+    </w:p>
+    <w:p>
+      <w:pPr>
+        <w:pStyle w:val="NoSpacing"/>
+        <w:spacing w:before="80" w:after="80"/>
+        <w:ind w:left="432"/>
+      </w:pPr>
+      <w:r>
+        <w:rPr>
+          <w:rFonts w:ascii="Courier New" w:hAnsi="Courier New"/>
+          <w:sz w:val="16"/>
+        </w:rPr>
+        <w:t>oc label namespace &lt;namespace&gt; \</w:t>
+        <w:br/>
+        <w:t xml:space="preserve">  openshift.io/cluster-monitoring=false \</w:t>
+        <w:br/>
+        <w:t xml:space="preserve">  openshift.io/user-monitoring=true \</w:t>
+        <w:br/>
+        <w:t xml:space="preserve">  --overwrite</w:t>
       </w:r>
     </w:p>
     <w:p>
@@ -988,7 +1865,16 @@
       </w:r>
     </w:p>
     <w:p>
+      <w:pPr>
+        <w:pStyle w:val="NoSpacing"/>
+        <w:spacing w:before="80" w:after="80"/>
+        <w:ind w:left="432"/>
+      </w:pPr>
       <w:r>
+        <w:rPr>
+          <w:rFonts w:ascii="Courier New" w:hAnsi="Courier New"/>
+          <w:sz w:val="16"/>
+        </w:rPr>
         <w:t>apiVersion: v1</w:t>
         <w:br/>
         <w:t>kind: Secret</w:t>
@@ -1008,6 +1894,20 @@
     </w:p>
     <w:p>
       <w:pPr>
+        <w:pStyle w:val="NoSpacing"/>
+        <w:spacing w:before="80" w:after="80"/>
+        <w:ind w:left="432"/>
+      </w:pPr>
+      <w:r>
+        <w:rPr>
+          <w:rFonts w:ascii="Courier New" w:hAnsi="Courier New"/>
+          <w:sz w:val="16"/>
+        </w:rPr>
+        <w:t>oc apply -f bearer-token-secret.yaml -n &lt;namespace&gt;</w:t>
+      </w:r>
+    </w:p>
+    <w:p>
+      <w:pPr>
         <w:pStyle w:val="Heading1"/>
       </w:pPr>
       <w:r>
@@ -1015,7 +1915,16 @@
       </w:r>
     </w:p>
     <w:p>
+      <w:pPr>
+        <w:pStyle w:val="NoSpacing"/>
+        <w:spacing w:before="80" w:after="80"/>
+        <w:ind w:left="432"/>
+      </w:pPr>
       <w:r>
+        <w:rPr>
+          <w:rFonts w:ascii="Courier New" w:hAnsi="Courier New"/>
+          <w:sz w:val="16"/>
+        </w:rPr>
         <w:t>apiVersion: monitoring.coreos.com/v1beta1</w:t>
         <w:br/>
         <w:t>kind: AlertmanagerConfig</w:t>
@@ -1046,7 +1955,11 @@
         <w:br/>
         <w:t xml:space="preserve">    continue: true</w:t>
         <w:br/>
-        <w:t xml:space="preserve">    groupBy: [alertname, namespace]</w:t>
+        <w:t xml:space="preserve">    groupBy:</w:t>
+        <w:br/>
+        <w:t xml:space="preserve">      - alertname</w:t>
+        <w:br/>
+        <w:t xml:space="preserve">      - namespace</w:t>
         <w:br/>
         <w:t xml:space="preserve">    groupWait: 30s</w:t>
         <w:br/>
@@ -1077,9 +1990,46 @@
         <w:t xml:space="preserve">                key: token</w:t>
       </w:r>
     </w:p>
+    <w:p>
+      <w:r>
+        <w:t xml:space="preserve">Replace </w:t>
+      </w:r>
+      <w:r>
+        <w:rPr>
+          <w:rFonts w:ascii="Courier New" w:hAnsi="Courier New"/>
+          <w:sz w:val="18"/>
+        </w:rPr>
+        <w:t>&lt;portal&gt;</w:t>
+      </w:r>
+      <w:r>
+        <w:t xml:space="preserve"> with your LogicMonitor portal name.</w:t>
+      </w:r>
+    </w:p>
+    <w:p>
+      <w:pPr>
+        <w:pStyle w:val="NoSpacing"/>
+        <w:spacing w:before="80" w:after="80"/>
+        <w:ind w:left="432"/>
+      </w:pPr>
+      <w:r>
+        <w:rPr>
+          <w:rFonts w:ascii="Courier New" w:hAnsi="Courier New"/>
+          <w:sz w:val="16"/>
+        </w:rPr>
+        <w:t>oc apply -f alertmanager-config.yaml -n &lt;namespace&gt;</w:t>
+      </w:r>
+    </w:p>
+    <w:p>
+      <w:pPr>
+        <w:pStyle w:val="Heading2"/>
+      </w:pPr>
+      <w:r>
+        <w:t>Configuration Parameters</w:t>
+      </w:r>
+    </w:p>
     <w:tbl>
       <w:tblPr>
-        <w:tblStyle w:val="LightList-Accent1"/>
+        <w:tblStyle w:val="LightGrid-Accent1"/>
         <w:tblW w:type="auto" w:w="0"/>
         <w:tblLook w:firstColumn="1" w:firstRow="1" w:lastColumn="0" w:lastRow="0" w:noHBand="0" w:noVBand="1" w:val="04A0"/>
       </w:tblPr>
@@ -1095,6 +2045,10 @@
           </w:tcPr>
           <w:p>
             <w:r>
+              <w:rPr>
+                <w:b/>
+                <w:sz w:val="18"/>
+              </w:rPr>
               <w:t>Parameter</w:t>
             </w:r>
           </w:p>
@@ -1105,6 +2059,10 @@
           </w:tcPr>
           <w:p>
             <w:r>
+              <w:rPr>
+                <w:b/>
+                <w:sz w:val="18"/>
+              </w:rPr>
               <w:t>Description</w:t>
             </w:r>
           </w:p>
@@ -1115,7 +2073,11 @@
           </w:tcPr>
           <w:p>
             <w:r>
-              <w:t>Recommended</w:t>
+              <w:rPr>
+                <w:b/>
+                <w:sz w:val="18"/>
+              </w:rPr>
+              <w:t>Recommended Value</w:t>
             </w:r>
           </w:p>
         </w:tc>
@@ -1127,6 +2089,9 @@
           </w:tcPr>
           <w:p>
             <w:r>
+              <w:rPr>
+                <w:sz w:val="18"/>
+              </w:rPr>
               <w:t>groupWait</w:t>
             </w:r>
           </w:p>
@@ -1137,6 +2102,9 @@
           </w:tcPr>
           <w:p>
             <w:r>
+              <w:rPr>
+                <w:sz w:val="18"/>
+              </w:rPr>
               <w:t>Time before sending first notification</w:t>
             </w:r>
           </w:p>
@@ -1147,6 +2115,9 @@
           </w:tcPr>
           <w:p>
             <w:r>
+              <w:rPr>
+                <w:sz w:val="18"/>
+              </w:rPr>
               <w:t>30s</w:t>
             </w:r>
           </w:p>
@@ -1159,6 +2130,9 @@
           </w:tcPr>
           <w:p>
             <w:r>
+              <w:rPr>
+                <w:sz w:val="18"/>
+              </w:rPr>
               <w:t>groupInterval</w:t>
             </w:r>
           </w:p>
@@ -1169,6 +2143,9 @@
           </w:tcPr>
           <w:p>
             <w:r>
+              <w:rPr>
+                <w:sz w:val="18"/>
+              </w:rPr>
               <w:t>Time between notifications for same group</w:t>
             </w:r>
           </w:p>
@@ -1179,6 +2156,9 @@
           </w:tcPr>
           <w:p>
             <w:r>
+              <w:rPr>
+                <w:sz w:val="18"/>
+              </w:rPr>
               <w:t>5m</w:t>
             </w:r>
           </w:p>
@@ -1191,6 +2171,9 @@
           </w:tcPr>
           <w:p>
             <w:r>
+              <w:rPr>
+                <w:sz w:val="18"/>
+              </w:rPr>
               <w:t>repeatInterval</w:t>
             </w:r>
           </w:p>
@@ -1201,6 +2184,9 @@
           </w:tcPr>
           <w:p>
             <w:r>
+              <w:rPr>
+                <w:sz w:val="18"/>
+              </w:rPr>
               <w:t>Time before re-sending a notification</w:t>
             </w:r>
           </w:p>
@@ -1211,6 +2197,9 @@
           </w:tcPr>
           <w:p>
             <w:r>
+              <w:rPr>
+                <w:sz w:val="18"/>
+              </w:rPr>
               <w:t>4h</w:t>
             </w:r>
           </w:p>
@@ -1223,6 +2212,9 @@
           </w:tcPr>
           <w:p>
             <w:r>
+              <w:rPr>
+                <w:sz w:val="18"/>
+              </w:rPr>
               <w:t>continue</w:t>
             </w:r>
           </w:p>
@@ -1233,6 +2225,9 @@
           </w:tcPr>
           <w:p>
             <w:r>
+              <w:rPr>
+                <w:sz w:val="18"/>
+              </w:rPr>
               <w:t>Allow alert to match additional routes</w:t>
             </w:r>
           </w:p>
@@ -1243,6 +2238,9 @@
           </w:tcPr>
           <w:p>
             <w:r>
+              <w:rPr>
+                <w:sz w:val="18"/>
+              </w:rPr>
               <w:t>true</w:t>
             </w:r>
           </w:p>
@@ -1255,6 +2253,9 @@
           </w:tcPr>
           <w:p>
             <w:r>
+              <w:rPr>
+                <w:sz w:val="18"/>
+              </w:rPr>
               <w:t>sendResolved</w:t>
             </w:r>
           </w:p>
@@ -1265,6 +2266,9 @@
           </w:tcPr>
           <w:p>
             <w:r>
+              <w:rPr>
+                <w:sz w:val="18"/>
+              </w:rPr>
               <w:t>Send notification when alert resolves</w:t>
             </w:r>
           </w:p>
@@ -1275,6 +2279,9 @@
           </w:tcPr>
           <w:p>
             <w:r>
+              <w:rPr>
+                <w:sz w:val="18"/>
+              </w:rPr>
               <w:t>true</w:t>
             </w:r>
           </w:p>
@@ -1291,12 +2298,12 @@
     </w:p>
     <w:p>
       <w:r>
-        <w:t>Alert rules MUST include explicit labels for routing and resource mapping. When using leaf-prometheus scope, the namespace label is not automatically injected.</w:t>
+        <w:t>Alert rules MUST include explicit labels for routing:</w:t>
       </w:r>
     </w:p>
     <w:tbl>
       <w:tblPr>
-        <w:tblStyle w:val="LightList-Accent1"/>
+        <w:tblStyle w:val="LightGrid-Accent1"/>
         <w:tblW w:type="auto" w:w="0"/>
         <w:tblLook w:firstColumn="1" w:firstRow="1" w:lastColumn="0" w:lastRow="0" w:noHBand="0" w:noVBand="1" w:val="04A0"/>
       </w:tblPr>
@@ -1312,6 +2319,10 @@
           </w:tcPr>
           <w:p>
             <w:r>
+              <w:rPr>
+                <w:b/>
+                <w:sz w:val="18"/>
+              </w:rPr>
               <w:t>Label</w:t>
             </w:r>
           </w:p>
@@ -1322,6 +2333,10 @@
           </w:tcPr>
           <w:p>
             <w:r>
+              <w:rPr>
+                <w:b/>
+                <w:sz w:val="18"/>
+              </w:rPr>
               <w:t>Purpose</w:t>
             </w:r>
           </w:p>
@@ -1332,6 +2347,10 @@
           </w:tcPr>
           <w:p>
             <w:r>
+              <w:rPr>
+                <w:b/>
+                <w:sz w:val="18"/>
+              </w:rPr>
               <w:t>Required</w:t>
             </w:r>
           </w:p>
@@ -1344,6 +2363,9 @@
           </w:tcPr>
           <w:p>
             <w:r>
+              <w:rPr>
+                <w:sz w:val="18"/>
+              </w:rPr>
               <w:t>namespace</w:t>
             </w:r>
           </w:p>
@@ -1354,6 +2376,9 @@
           </w:tcPr>
           <w:p>
             <w:r>
+              <w:rPr>
+                <w:sz w:val="18"/>
+              </w:rPr>
               <w:t>Routes alert to correct AlertmanagerConfig</w:t>
             </w:r>
           </w:p>
@@ -1364,6 +2389,9 @@
           </w:tcPr>
           <w:p>
             <w:r>
+              <w:rPr>
+                <w:sz w:val="18"/>
+              </w:rPr>
               <w:t>Yes</w:t>
             </w:r>
           </w:p>
@@ -1376,7 +2404,10 @@
           </w:tcPr>
           <w:p>
             <w:r>
-              <w:t>cluster_name</w:t>
+              <w:rPr>
+                <w:sz w:val="18"/>
+              </w:rPr>
+              <w:t>severity</w:t>
             </w:r>
           </w:p>
         </w:tc>
@@ -1386,7 +2417,10 @@
           </w:tcPr>
           <w:p>
             <w:r>
-              <w:t>Enables resource mapping in LogicMonitor</w:t>
+              <w:rPr>
+                <w:sz w:val="18"/>
+              </w:rPr>
+              <w:t>Matches AlertmanagerConfig route matchers</w:t>
             </w:r>
           </w:p>
         </w:tc>
@@ -1396,6 +2430,9 @@
           </w:tcPr>
           <w:p>
             <w:r>
+              <w:rPr>
+                <w:sz w:val="18"/>
+              </w:rPr>
               <w:t>Yes</w:t>
             </w:r>
           </w:p>
@@ -1408,7 +2445,10 @@
           </w:tcPr>
           <w:p>
             <w:r>
-              <w:t>severity</w:t>
+              <w:rPr>
+                <w:sz w:val="18"/>
+              </w:rPr>
+              <w:t>cluster_name</w:t>
             </w:r>
           </w:p>
         </w:tc>
@@ -1418,7 +2458,10 @@
           </w:tcPr>
           <w:p>
             <w:r>
-              <w:t>Matches AlertmanagerConfig route matchers</w:t>
+              <w:rPr>
+                <w:sz w:val="18"/>
+              </w:rPr>
+              <w:t>Identifies cluster in LM Logs</w:t>
             </w:r>
           </w:p>
         </w:tc>
@@ -1428,12 +2471,100 @@
           </w:tcPr>
           <w:p>
             <w:r>
-              <w:t>Yes</w:t>
+              <w:rPr>
+                <w:sz w:val="18"/>
+              </w:rPr>
+              <w:t>Provided by external labels (Step 1b)</w:t>
             </w:r>
           </w:p>
         </w:tc>
       </w:tr>
     </w:tbl>
+    <w:p>
+      <w:r>
+        <w:t xml:space="preserve">When using </w:t>
+      </w:r>
+      <w:r>
+        <w:rPr>
+          <w:rFonts w:ascii="Courier New" w:hAnsi="Courier New"/>
+          <w:sz w:val="18"/>
+        </w:rPr>
+        <w:t>leaf-prometheus</w:t>
+      </w:r>
+      <w:r>
+        <w:t xml:space="preserve"> scope, the namespace label is not automatically injected. Alerts without the namespace label will not match any route.</w:t>
+      </w:r>
+    </w:p>
+    <w:p>
+      <w:r>
+        <w:t xml:space="preserve">If you configured </w:t>
+      </w:r>
+      <w:r>
+        <w:rPr>
+          <w:rFonts w:ascii="Courier New" w:hAnsi="Courier New"/>
+          <w:sz w:val="18"/>
+        </w:rPr>
+        <w:t>cluster_name</w:t>
+      </w:r>
+      <w:r>
+        <w:t xml:space="preserve"> as an external label in Step 1b, you do not need to add it to individual PrometheusRules. It is injected into all alerts automatically.</w:t>
+      </w:r>
+    </w:p>
+    <w:p>
+      <w:r>
+        <w:t>Example PrometheusRule:</w:t>
+      </w:r>
+    </w:p>
+    <w:p>
+      <w:pPr>
+        <w:pStyle w:val="NoSpacing"/>
+        <w:spacing w:before="80" w:after="80"/>
+        <w:ind w:left="432"/>
+      </w:pPr>
+      <w:r>
+        <w:rPr>
+          <w:rFonts w:ascii="Courier New" w:hAnsi="Courier New"/>
+          <w:sz w:val="16"/>
+        </w:rPr>
+        <w:t>apiVersion: monitoring.coreos.com/v1</w:t>
+        <w:br/>
+        <w:t>kind: PrometheusRule</w:t>
+        <w:br/>
+        <w:t>metadata:</w:t>
+        <w:br/>
+        <w:t xml:space="preserve">  name: application-alerts</w:t>
+        <w:br/>
+        <w:t xml:space="preserve">  namespace: my-namespace</w:t>
+        <w:br/>
+        <w:t xml:space="preserve">  labels:</w:t>
+        <w:br/>
+        <w:t xml:space="preserve">    openshift.io/prometheus-rule-evaluation-scope: leaf-prometheus</w:t>
+        <w:br/>
+        <w:t>spec:</w:t>
+        <w:br/>
+        <w:t xml:space="preserve">  groups:</w:t>
+        <w:br/>
+        <w:t xml:space="preserve">    - name: application.alerts</w:t>
+        <w:br/>
+        <w:t xml:space="preserve">      rules:</w:t>
+        <w:br/>
+        <w:t xml:space="preserve">        - alert: HighErrorRate</w:t>
+        <w:br/>
+        <w:t xml:space="preserve">          expr: rate(http_errors_total[5m]) &gt; 10</w:t>
+        <w:br/>
+        <w:t xml:space="preserve">          for: 5m</w:t>
+        <w:br/>
+        <w:t xml:space="preserve">          labels:</w:t>
+        <w:br/>
+        <w:t xml:space="preserve">            severity: warning</w:t>
+        <w:br/>
+        <w:t xml:space="preserve">            namespace: my-namespace</w:t>
+        <w:br/>
+        <w:t xml:space="preserve">          annotations:</w:t>
+        <w:br/>
+        <w:t xml:space="preserve">            summary: "High error rate detected"</w:t>
+      </w:r>
+    </w:p>
     <w:p>
       <w:pPr>
         <w:pStyle w:val="Heading1"/>
@@ -1443,23 +2574,149 @@
       </w:r>
     </w:p>
     <w:p>
+      <w:pPr>
+        <w:pStyle w:val="Heading2"/>
+      </w:pPr>
       <w:r>
-        <w:t>Test webhook directly:</w:t>
+        <w:t>Test Webhook Directly</w:t>
+      </w:r>
+    </w:p>
+    <w:p>
+      <w:pPr>
+        <w:pStyle w:val="NoSpacing"/>
+        <w:spacing w:before="80" w:after="80"/>
+        <w:ind w:left="432"/>
+      </w:pPr>
+      <w:r>
+        <w:rPr>
+          <w:rFonts w:ascii="Courier New" w:hAnsi="Courier New"/>
+          <w:sz w:val="16"/>
+        </w:rPr>
+        <w:t>curl -X POST "https://&lt;portal&gt;.logicmonitor.com/rest/api/v1/webhook/ingest/openshift_alertmanager" \</w:t>
+        <w:br/>
+        <w:t xml:space="preserve">  -H "Authorization: Bearer &lt;your-token&gt;" \</w:t>
+        <w:br/>
+        <w:t xml:space="preserve">  -H "Content-Type: application/json" \</w:t>
+        <w:br/>
+        <w:t xml:space="preserve">  -d '{</w:t>
+        <w:br/>
+        <w:t xml:space="preserve">    "status": "firing",</w:t>
+        <w:br/>
+        <w:t xml:space="preserve">    "alerts": [{</w:t>
+        <w:br/>
+        <w:t xml:space="preserve">      "status": "firing",</w:t>
+        <w:br/>
+        <w:t xml:space="preserve">      "labels": {</w:t>
+        <w:br/>
+        <w:t xml:space="preserve">        "alertname": "TestAlert",</w:t>
+        <w:br/>
+        <w:t xml:space="preserve">        "severity": "warning",</w:t>
+        <w:br/>
+        <w:t xml:space="preserve">        "namespace": "test",</w:t>
+        <w:br/>
+        <w:t xml:space="preserve">        "cluster_name": "&lt;your-cluster-name&gt;"</w:t>
+        <w:br/>
+        <w:t xml:space="preserve">      },</w:t>
+        <w:br/>
+        <w:t xml:space="preserve">      "annotations": {</w:t>
+        <w:br/>
+        <w:t xml:space="preserve">        "summary": "Test alert for webhook verification"</w:t>
+        <w:br/>
+        <w:t xml:space="preserve">      }</w:t>
+        <w:br/>
+        <w:t xml:space="preserve">    }]</w:t>
+        <w:br/>
+        <w:t xml:space="preserve">  }'</w:t>
       </w:r>
     </w:p>
     <w:p>
       <w:r>
-        <w:t>curl -X POST "https://&lt;portal&gt;.logicmonitor.com/rest/api/v1/webhook/ingest/openshift_alertmanager" -H "Authorization: Bearer &lt;token&gt;" -H "Content-Type: application/json" -d '{"status":"firing","alerts":[{"status":"firing","labels":{"alertname":"TestAlert","severity":"warning","namespace":"test","cluster_name":"&lt;cluster&gt;"}}]}'</w:t>
+        <w:t xml:space="preserve">Expected response: </w:t>
+      </w:r>
+      <w:r>
+        <w:rPr>
+          <w:rFonts w:ascii="Courier New" w:hAnsi="Courier New"/>
+          <w:sz w:val="18"/>
+        </w:rPr>
+        <w:t>Accepted</w:t>
+      </w:r>
+      <w:r>
+        <w:t xml:space="preserve"> (HTTP 202).</w:t>
+      </w:r>
+    </w:p>
+    <w:p>
+      <w:pPr>
+        <w:pStyle w:val="Heading2"/>
+      </w:pPr>
+      <w:r>
+        <w:t>Verify AlertmanagerConfig</w:t>
+      </w:r>
+    </w:p>
+    <w:p>
+      <w:pPr>
+        <w:pStyle w:val="NoSpacing"/>
+        <w:spacing w:before="80" w:after="80"/>
+        <w:ind w:left="432"/>
+      </w:pPr>
+      <w:r>
+        <w:rPr>
+          <w:rFonts w:ascii="Courier New" w:hAnsi="Courier New"/>
+          <w:sz w:val="16"/>
+        </w:rPr>
+        <w:t>oc get alertmanagerconfig -A -l openshift.io/user-monitoring=true</w:t>
+      </w:r>
+    </w:p>
+    <w:p>
+      <w:pPr>
+        <w:pStyle w:val="Heading2"/>
+      </w:pPr>
+      <w:r>
+        <w:t>Verify Generated Configuration</w:t>
+      </w:r>
+    </w:p>
+    <w:p>
+      <w:pPr>
+        <w:pStyle w:val="NoSpacing"/>
+        <w:spacing w:before="80" w:after="80"/>
+        <w:ind w:left="432"/>
+      </w:pPr>
+      <w:r>
+        <w:rPr>
+          <w:rFonts w:ascii="Courier New" w:hAnsi="Courier New"/>
+          <w:sz w:val="16"/>
+        </w:rPr>
+        <w:t>oc get secret alertmanager-user-workload-generated \</w:t>
+        <w:br/>
+        <w:t xml:space="preserve">  -n openshift-user-workload-monitoring \</w:t>
+        <w:br/>
+        <w:t xml:space="preserve">  -o jsonpath='{.data.alertmanager\.yaml\.gz}' | base64 -d | gunzip</w:t>
+      </w:r>
+    </w:p>
+    <w:p>
+      <w:pPr>
+        <w:pStyle w:val="Heading2"/>
+      </w:pPr>
+      <w:r>
+        <w:t>Verify in LM Logs</w:t>
       </w:r>
     </w:p>
     <w:p>
       <w:r>
-        <w:t>Expected response: Accepted (HTTP 202).</w:t>
+        <w:t>Query:</w:t>
       </w:r>
     </w:p>
     <w:p>
+      <w:pPr>
+        <w:pStyle w:val="NoSpacing"/>
+        <w:spacing w:before="80" w:after="80"/>
+        <w:ind w:left="432"/>
+      </w:pPr>
       <w:r>
-        <w:t>Verify in LM Logs: source_type="prometheus_alertmanager" AND alertname="TestAlert"</w:t>
+        <w:rPr>
+          <w:rFonts w:ascii="Courier New" w:hAnsi="Courier New"/>
+          <w:sz w:val="16"/>
+        </w:rPr>
+        <w:t>_lm.logsource_name = "OpenShift_AlertManager_Webhook"</w:t>
       </w:r>
     </w:p>
     <w:p>
@@ -1470,9 +2727,230 @@
         <w:t>10. LMQL Query Reference</w:t>
       </w:r>
     </w:p>
+    <w:p>
+      <w:pPr>
+        <w:pStyle w:val="NoSpacing"/>
+        <w:spacing w:before="80" w:after="80"/>
+        <w:ind w:left="432"/>
+      </w:pPr>
+      <w:r>
+        <w:rPr>
+          <w:rFonts w:ascii="Courier New" w:hAnsi="Courier New"/>
+          <w:sz w:val="16"/>
+        </w:rPr>
+        <w:t># All AlertManager webhook logs</w:t>
+        <w:br/>
+        <w:t>_lm.logsource_name = "OpenShift_AlertManager_Webhook"</w:t>
+        <w:br/>
+        <w:br/>
+        <w:t># Critical severity alerts</w:t>
+        <w:br/>
+        <w:t>_lm.logsource_name = "OpenShift_AlertManager_Webhook" AND a_severity = "critical"</w:t>
+        <w:br/>
+        <w:br/>
+        <w:t># Specific alert name</w:t>
+        <w:br/>
+        <w:t>_lm.logsource_name = "OpenShift_AlertManager_Webhook" AND a_alertname = "HighErrorRate"</w:t>
+        <w:br/>
+        <w:br/>
+        <w:t># Specific cluster</w:t>
+        <w:br/>
+        <w:t>_lm.logsource_name = "OpenShift_AlertManager_Webhook" AND a_nodename = "my-cluster"</w:t>
+        <w:br/>
+        <w:br/>
+        <w:t># Search within alert descriptions</w:t>
+        <w:br/>
+        <w:t>_lm.logsource_name = "OpenShift_AlertManager_Webhook" AND "backup failed"</w:t>
+      </w:r>
+    </w:p>
+    <w:p>
+      <w:pPr>
+        <w:pStyle w:val="Heading1"/>
+      </w:pPr>
+      <w:r>
+        <w:t>11. Adding New Namespaces</w:t>
+      </w:r>
+    </w:p>
+    <w:p>
+      <w:r>
+        <w:t>Repeat for each namespace that needs alert forwarding:</w:t>
+      </w:r>
+    </w:p>
+    <w:p>
+      <w:pPr>
+        <w:pStyle w:val="NoSpacing"/>
+        <w:spacing w:before="80" w:after="80"/>
+        <w:ind w:left="432"/>
+      </w:pPr>
+      <w:r>
+        <w:rPr>
+          <w:rFonts w:ascii="Courier New" w:hAnsi="Courier New"/>
+          <w:sz w:val="16"/>
+        </w:rPr>
+        <w:t># 1. Label namespace</w:t>
+        <w:br/>
+        <w:t>oc label namespace &lt;namespace&gt; \</w:t>
+        <w:br/>
+        <w:t xml:space="preserve">  openshift.io/cluster-monitoring=false \</w:t>
+        <w:br/>
+        <w:t xml:space="preserve">  openshift.io/user-monitoring=true \</w:t>
+        <w:br/>
+        <w:t xml:space="preserve">  --overwrite</w:t>
+        <w:br/>
+        <w:br/>
+        <w:t># 2. Deploy secret</w:t>
+        <w:br/>
+        <w:t>oc create secret generic logicmonitor-bearer-token \</w:t>
+        <w:br/>
+        <w:t xml:space="preserve">  --from-literal=token="&lt;bearer-token&gt;" \</w:t>
+        <w:br/>
+        <w:t xml:space="preserve">  -n &lt;namespace&gt;</w:t>
+        <w:br/>
+        <w:br/>
+        <w:t># 3. Deploy AlertmanagerConfig</w:t>
+        <w:br/>
+        <w:t>oc apply -f alertmanager-config.yaml -n &lt;namespace&gt;</w:t>
+        <w:br/>
+        <w:br/>
+        <w:t># 4. Verify</w:t>
+        <w:br/>
+        <w:t>oc get alertmanagerconfig -n &lt;namespace&gt;</w:t>
+      </w:r>
+    </w:p>
+    <w:p>
+      <w:pPr>
+        <w:pStyle w:val="Heading1"/>
+      </w:pPr>
+      <w:r>
+        <w:t>12. Bearer Token Rotation</w:t>
+      </w:r>
+    </w:p>
+    <w:p>
+      <w:pPr>
+        <w:pStyle w:val="NoSpacing"/>
+        <w:spacing w:before="80" w:after="80"/>
+        <w:ind w:left="432"/>
+      </w:pPr>
+      <w:r>
+        <w:rPr>
+          <w:rFonts w:ascii="Courier New" w:hAnsi="Courier New"/>
+          <w:sz w:val="16"/>
+        </w:rPr>
+        <w:t># Update secrets in all namespaces</w:t>
+        <w:br/>
+        <w:t>for ns in namespace-a namespace-b; do</w:t>
+        <w:br/>
+        <w:t xml:space="preserve">  oc delete secret logicmonitor-bearer-token -n $ns --ignore-not-found</w:t>
+        <w:br/>
+        <w:t xml:space="preserve">  oc create secret generic logicmonitor-bearer-token \</w:t>
+        <w:br/>
+        <w:t xml:space="preserve">    --from-literal=token="&lt;new-token&gt;" \</w:t>
+        <w:br/>
+        <w:t xml:space="preserve">    -n $ns</w:t>
+        <w:br/>
+        <w:t>done</w:t>
+        <w:br/>
+        <w:br/>
+        <w:t># Restart AlertManager to pick up changes</w:t>
+        <w:br/>
+        <w:t>oc delete pod -n openshift-user-workload-monitoring \</w:t>
+        <w:br/>
+        <w:t xml:space="preserve">  -l app.kubernetes.io/name=alertmanager</w:t>
+      </w:r>
+    </w:p>
+    <w:p>
+      <w:pPr>
+        <w:pStyle w:val="Heading1"/>
+      </w:pPr>
+      <w:r>
+        <w:t>13. Managed Platform Notes (ARO, ROSA)</w:t>
+      </w:r>
+    </w:p>
+    <w:p>
+      <w:r>
+        <w:t xml:space="preserve">On managed OpenShift platforms (Azure Red Hat OpenShift, Red Hat OpenShift on AWS), the </w:t>
+      </w:r>
+      <w:r>
+        <w:rPr>
+          <w:rFonts w:ascii="Courier New" w:hAnsi="Courier New"/>
+          <w:sz w:val="18"/>
+        </w:rPr>
+        <w:t>openshift-monitoring</w:t>
+      </w:r>
+      <w:r>
+        <w:t xml:space="preserve"> namespace is managed by the cloud provider and Red Hat SRE:</w:t>
+      </w:r>
+    </w:p>
+    <w:p>
+      <w:pPr>
+        <w:pStyle w:val="ListBullet"/>
+      </w:pPr>
+      <w:r>
+        <w:t>You cannot modify the platform AlertManager configuration.</w:t>
+      </w:r>
+    </w:p>
+    <w:p>
+      <w:pPr>
+        <w:pStyle w:val="ListBullet"/>
+      </w:pPr>
+      <w:r>
+        <w:t>You cannot add custom receivers to the platform AlertManager.</w:t>
+      </w:r>
+    </w:p>
+    <w:p>
+      <w:pPr>
+        <w:pStyle w:val="ListBullet"/>
+      </w:pPr>
+      <w:r>
+        <w:t>Platform alerts route to Red Hat SRE by default.</w:t>
+      </w:r>
+    </w:p>
+    <w:p>
+      <w:r>
+        <w:t>All custom webhook routing must go through user workload monitoring, which is what this guide configures.</w:t>
+      </w:r>
+    </w:p>
+    <w:p>
+      <w:r>
+        <w:t xml:space="preserve">To receive platform-level alerts in LogicMonitor, create a dedicated namespace (e.g., </w:t>
+      </w:r>
+      <w:r>
+        <w:rPr>
+          <w:rFonts w:ascii="Courier New" w:hAnsi="Courier New"/>
+          <w:sz w:val="18"/>
+        </w:rPr>
+        <w:t>platform-alerts</w:t>
+      </w:r>
+      <w:r>
+        <w:t>), deploy PrometheusRules that query kube-state-metrics for infrastructure conditions, and route through the user workload AlertManager.</w:t>
+      </w:r>
+    </w:p>
+    <w:p>
+      <w:r>
+        <w:t xml:space="preserve">ARO clusters have egress lockdown enabled by default. Whitelist </w:t>
+      </w:r>
+      <w:r>
+        <w:rPr>
+          <w:rFonts w:ascii="Courier New" w:hAnsi="Courier New"/>
+          <w:sz w:val="18"/>
+        </w:rPr>
+        <w:t>*.logicmonitor.com</w:t>
+      </w:r>
+      <w:r>
+        <w:t xml:space="preserve"> on port 443 in your firewall rules if outbound webhooks are blocked.</w:t>
+      </w:r>
+    </w:p>
+    <w:p>
+      <w:pPr>
+        <w:pStyle w:val="Heading1"/>
+      </w:pPr>
+      <w:r>
+        <w:t>14. Troubleshooting</w:t>
+      </w:r>
+    </w:p>
     <w:tbl>
       <w:tblPr>
-        <w:tblStyle w:val="LightList-Accent1"/>
+        <w:tblStyle w:val="LightGrid-Accent1"/>
         <w:tblW w:type="auto" w:w="0"/>
         <w:tblLook w:firstColumn="1" w:firstRow="1" w:lastColumn="0" w:lastRow="0" w:noHBand="0" w:noVBand="1" w:val="04A0"/>
       </w:tblPr>
@@ -1487,308 +2965,10 @@
           </w:tcPr>
           <w:p>
             <w:r>
-              <w:t>Description</w:t>
-            </w:r>
-          </w:p>
-        </w:tc>
-        <w:tc>
-          <w:tcPr>
-            <w:tcW w:type="dxa" w:w="4320"/>
-          </w:tcPr>
-          <w:p>
-            <w:r>
-              <w:t>Query</w:t>
-            </w:r>
-          </w:p>
-        </w:tc>
-      </w:tr>
-      <w:tr>
-        <w:tc>
-          <w:tcPr>
-            <w:tcW w:type="dxa" w:w="4320"/>
-          </w:tcPr>
-          <w:p>
-            <w:r>
-              <w:t>All AlertManager logs</w:t>
-            </w:r>
-          </w:p>
-        </w:tc>
-        <w:tc>
-          <w:tcPr>
-            <w:tcW w:type="dxa" w:w="4320"/>
-          </w:tcPr>
-          <w:p>
-            <w:r>
-              <w:t>source_type="prometheus_alertmanager"</w:t>
-            </w:r>
-          </w:p>
-        </w:tc>
-      </w:tr>
-      <w:tr>
-        <w:tc>
-          <w:tcPr>
-            <w:tcW w:type="dxa" w:w="4320"/>
-          </w:tcPr>
-          <w:p>
-            <w:r>
-              <w:t>Firing alerts only</w:t>
-            </w:r>
-          </w:p>
-        </w:tc>
-        <w:tc>
-          <w:tcPr>
-            <w:tcW w:type="dxa" w:w="4320"/>
-          </w:tcPr>
-          <w:p>
-            <w:r>
-              <w:t>source_type="prometheus_alertmanager" AND status="firing"</w:t>
-            </w:r>
-          </w:p>
-        </w:tc>
-      </w:tr>
-      <w:tr>
-        <w:tc>
-          <w:tcPr>
-            <w:tcW w:type="dxa" w:w="4320"/>
-          </w:tcPr>
-          <w:p>
-            <w:r>
-              <w:t>Resolved alerts</w:t>
-            </w:r>
-          </w:p>
-        </w:tc>
-        <w:tc>
-          <w:tcPr>
-            <w:tcW w:type="dxa" w:w="4320"/>
-          </w:tcPr>
-          <w:p>
-            <w:r>
-              <w:t>source_type="prometheus_alertmanager" AND status="resolved"</w:t>
-            </w:r>
-          </w:p>
-        </w:tc>
-      </w:tr>
-      <w:tr>
-        <w:tc>
-          <w:tcPr>
-            <w:tcW w:type="dxa" w:w="4320"/>
-          </w:tcPr>
-          <w:p>
-            <w:r>
-              <w:t>Critical severity</w:t>
-            </w:r>
-          </w:p>
-        </w:tc>
-        <w:tc>
-          <w:tcPr>
-            <w:tcW w:type="dxa" w:w="4320"/>
-          </w:tcPr>
-          <w:p>
-            <w:r>
-              <w:t>source_type="prometheus_alertmanager" AND severity="critical"</w:t>
-            </w:r>
-          </w:p>
-        </w:tc>
-      </w:tr>
-      <w:tr>
-        <w:tc>
-          <w:tcPr>
-            <w:tcW w:type="dxa" w:w="4320"/>
-          </w:tcPr>
-          <w:p>
-            <w:r>
-              <w:t>Specific namespace</w:t>
-            </w:r>
-          </w:p>
-        </w:tc>
-        <w:tc>
-          <w:tcPr>
-            <w:tcW w:type="dxa" w:w="4320"/>
-          </w:tcPr>
-          <w:p>
-            <w:r>
-              <w:t>source_type="prometheus_alertmanager" AND namespace="production"</w:t>
-            </w:r>
-          </w:p>
-        </w:tc>
-      </w:tr>
-      <w:tr>
-        <w:tc>
-          <w:tcPr>
-            <w:tcW w:type="dxa" w:w="4320"/>
-          </w:tcPr>
-          <w:p>
-            <w:r>
-              <w:t>Specific cluster</w:t>
-            </w:r>
-          </w:p>
-        </w:tc>
-        <w:tc>
-          <w:tcPr>
-            <w:tcW w:type="dxa" w:w="4320"/>
-          </w:tcPr>
-          <w:p>
-            <w:r>
-              <w:t>source_type="prometheus_alertmanager" AND cluster_name="my-cluster"</w:t>
-            </w:r>
-          </w:p>
-        </w:tc>
-      </w:tr>
-      <w:tr>
-        <w:tc>
-          <w:tcPr>
-            <w:tcW w:type="dxa" w:w="4320"/>
-          </w:tcPr>
-          <w:p>
-            <w:r>
-              <w:t>Count by severity</w:t>
-            </w:r>
-          </w:p>
-        </w:tc>
-        <w:tc>
-          <w:tcPr>
-            <w:tcW w:type="dxa" w:w="4320"/>
-          </w:tcPr>
-          <w:p>
-            <w:r>
-              <w:t>source_type="prometheus_alertmanager" | count by severity</w:t>
-            </w:r>
-          </w:p>
-        </w:tc>
-      </w:tr>
-      <w:tr>
-        <w:tc>
-          <w:tcPr>
-            <w:tcW w:type="dxa" w:w="4320"/>
-          </w:tcPr>
-          <w:p>
-            <w:r>
-              <w:t>Top 10 alerts</w:t>
-            </w:r>
-          </w:p>
-        </w:tc>
-        <w:tc>
-          <w:tcPr>
-            <w:tcW w:type="dxa" w:w="4320"/>
-          </w:tcPr>
-          <w:p>
-            <w:r>
-              <w:t>source_type="prometheus_alertmanager" | count by alertname | sort by _count desc | limit 10</w:t>
-            </w:r>
-          </w:p>
-        </w:tc>
-      </w:tr>
-    </w:tbl>
-    <w:p>
-      <w:pPr>
-        <w:pStyle w:val="Heading1"/>
-      </w:pPr>
-      <w:r>
-        <w:t>11. Adding New Namespaces</w:t>
-      </w:r>
-    </w:p>
-    <w:p>
-      <w:pPr>
-        <w:pStyle w:val="ListNumber"/>
-      </w:pPr>
-      <w:r>
-        <w:t>Label namespace: oc label namespace &lt;ns&gt; openshift.io/cluster-monitoring=false openshift.io/user-monitoring=true --overwrite</w:t>
-      </w:r>
-    </w:p>
-    <w:p>
-      <w:pPr>
-        <w:pStyle w:val="ListNumber"/>
-      </w:pPr>
-      <w:r>
-        <w:t>Deploy secret: oc create secret generic logicmonitor-bearer-token --from-literal=token="&lt;token&gt;" -n &lt;ns&gt;</w:t>
-      </w:r>
-    </w:p>
-    <w:p>
-      <w:pPr>
-        <w:pStyle w:val="ListNumber"/>
-      </w:pPr>
-      <w:r>
-        <w:t>Deploy AlertmanagerConfig: oc apply -f alertmanager-config.yaml -n &lt;ns&gt;</w:t>
-      </w:r>
-    </w:p>
-    <w:p>
-      <w:pPr>
-        <w:pStyle w:val="ListNumber"/>
-      </w:pPr>
-      <w:r>
-        <w:t>Verify: oc get alertmanagerconfig -n &lt;ns&gt;</w:t>
-      </w:r>
-    </w:p>
-    <w:p>
-      <w:pPr>
-        <w:pStyle w:val="Heading1"/>
-      </w:pPr>
-      <w:r>
-        <w:t>12. Bearer Token Rotation</w:t>
-      </w:r>
-    </w:p>
-    <w:p>
-      <w:r>
-        <w:t>Update secrets in all namespaces, then restart AlertManager:</w:t>
-      </w:r>
-    </w:p>
-    <w:p>
-      <w:r>
-        <w:t>for ns in namespace-a namespace-b; do</w:t>
-        <w:br/>
-        <w:t xml:space="preserve">  oc delete secret logicmonitor-bearer-token -n $ns --ignore-not-found</w:t>
-        <w:br/>
-        <w:t xml:space="preserve">  oc create secret generic logicmonitor-bearer-token --from-literal=token="&lt;new-token&gt;" -n $ns</w:t>
-        <w:br/>
-        <w:t>done</w:t>
-        <w:br/>
-        <w:br/>
-        <w:t>oc delete pod -n openshift-user-workload-monitoring -l app.kubernetes.io/name=alertmanager</w:t>
-      </w:r>
-    </w:p>
-    <w:p>
-      <w:pPr>
-        <w:pStyle w:val="Heading1"/>
-      </w:pPr>
-      <w:r>
-        <w:t>13. Managed Platform Notes (ARO, ROSA)</w:t>
-      </w:r>
-    </w:p>
-    <w:p>
-      <w:r>
-        <w:t>On managed OpenShift platforms (Azure Red Hat OpenShift, Red Hat OpenShift on AWS), the openshift-monitoring namespace is managed by the cloud provider and Red Hat SRE. You cannot modify the platform AlertManager or add custom receivers. All custom webhook routing must go through user workload monitoring.</w:t>
-      </w:r>
-    </w:p>
-    <w:p>
-      <w:r>
-        <w:t>ARO clusters have egress lockdown enabled by default. Whitelist *.logicmonitor.com on port 443 in your firewall rules if outbound webhooks are blocked.</w:t>
-      </w:r>
-    </w:p>
-    <w:p>
-      <w:pPr>
-        <w:pStyle w:val="Heading1"/>
-      </w:pPr>
-      <w:r>
-        <w:t>14. Troubleshooting</w:t>
-      </w:r>
-    </w:p>
-    <w:tbl>
-      <w:tblPr>
-        <w:tblStyle w:val="LightList-Accent1"/>
-        <w:tblW w:type="auto" w:w="0"/>
-        <w:tblLook w:firstColumn="1" w:firstRow="1" w:lastColumn="0" w:lastRow="0" w:noHBand="0" w:noVBand="1" w:val="04A0"/>
-      </w:tblPr>
-      <w:tblGrid>
-        <w:gridCol w:w="4320"/>
-        <w:gridCol w:w="4320"/>
-      </w:tblGrid>
-      <w:tr>
-        <w:tc>
-          <w:tcPr>
-            <w:tcW w:type="dxa" w:w="4320"/>
-          </w:tcPr>
-          <w:p>
-            <w:r>
+              <w:rPr>
+                <w:b/>
+                <w:sz w:val="18"/>
+              </w:rPr>
               <w:t>Symptom</w:t>
             </w:r>
           </w:p>
@@ -1799,6 +2979,10 @@
           </w:tcPr>
           <w:p>
             <w:r>
+              <w:rPr>
+                <w:b/>
+                <w:sz w:val="18"/>
+              </w:rPr>
               <w:t>Resolution</w:t>
             </w:r>
           </w:p>
@@ -1811,6 +2995,9 @@
           </w:tcPr>
           <w:p>
             <w:r>
+              <w:rPr>
+                <w:sz w:val="18"/>
+              </w:rPr>
               <w:t>AlertmanagerConfig not applied</w:t>
             </w:r>
           </w:p>
@@ -1821,7 +3008,10 @@
           </w:tcPr>
           <w:p>
             <w:r>
-              <w:t>Verify namespace and AlertmanagerConfig both have openshift.io/user-monitoring: "true" label</w:t>
+              <w:rPr>
+                <w:sz w:val="18"/>
+              </w:rPr>
+              <w:t>Verify namespace and AlertmanagerConfig both have `openshift.io/user-monitoring: "true"` label</w:t>
             </w:r>
           </w:p>
         </w:tc>
@@ -1833,28 +3023,9 @@
           </w:tcPr>
           <w:p>
             <w:r>
-              <w:t>Routes not in generated config</w:t>
-            </w:r>
-          </w:p>
-        </w:tc>
-        <w:tc>
-          <w:tcPr>
-            <w:tcW w:type="dxa" w:w="4320"/>
-          </w:tcPr>
-          <w:p>
-            <w:r>
-              <w:t>Ensure enableAlertmanagerConfig: true is set in user-workload-monitoring-config ConfigMap</w:t>
-            </w:r>
-          </w:p>
-        </w:tc>
-      </w:tr>
-      <w:tr>
-        <w:tc>
-          <w:tcPr>
-            <w:tcW w:type="dxa" w:w="4320"/>
-          </w:tcPr>
-          <w:p>
-            <w:r>
+              <w:rPr>
+                <w:sz w:val="18"/>
+              </w:rPr>
               <w:t>Webhook returns 401</w:t>
             </w:r>
           </w:p>
@@ -1865,6 +3036,9 @@
           </w:tcPr>
           <w:p>
             <w:r>
+              <w:rPr>
+                <w:sz w:val="18"/>
+              </w:rPr>
               <w:t>Check Bearer token is correct and has LM Logs permissions</w:t>
             </w:r>
           </w:p>
@@ -1877,7 +3051,10 @@
           </w:tcPr>
           <w:p>
             <w:r>
-              <w:t>Alerts not reaching LM</w:t>
+              <w:rPr>
+                <w:sz w:val="18"/>
+              </w:rPr>
+              <w:t>Webhook returns 202 but no logs</w:t>
             </w:r>
           </w:p>
         </w:tc>
@@ -1887,7 +3064,10 @@
           </w:tcPr>
           <w:p>
             <w:r>
-              <w:t>Add explicit namespace label to PrometheusRule alert definitions</w:t>
+              <w:rPr>
+                <w:sz w:val="18"/>
+              </w:rPr>
+              <w:t>Verify API user has `lm_logs_administrator` role. Check LogSource uses JSONPath for WebhookAttribute values (e.g., `$.status` not `status`). Do not add SourceName filters.</w:t>
             </w:r>
           </w:p>
         </w:tc>
@@ -1899,7 +3079,10 @@
           </w:tcPr>
           <w:p>
             <w:r>
-              <w:t>Logs not mapping to resources</w:t>
+              <w:rPr>
+                <w:sz w:val="18"/>
+              </w:rPr>
+              <w:t>Alerts not reaching LM</w:t>
             </w:r>
           </w:p>
         </w:tc>
@@ -1909,7 +3092,10 @@
           </w:tcPr>
           <w:p>
             <w:r>
-              <w:t>Add openshift.cluster.name property to cluster resource and cluster_name label to alerts</w:t>
+              <w:rPr>
+                <w:sz w:val="18"/>
+              </w:rPr>
+              <w:t>Add explicit `namespace` label to PrometheusRule alert definitions</w:t>
             </w:r>
           </w:p>
         </w:tc>
@@ -1921,6 +3107,37 @@
           </w:tcPr>
           <w:p>
             <w:r>
+              <w:rPr>
+                <w:sz w:val="18"/>
+              </w:rPr>
+              <w:t>No Resource/Resource Type on logs</w:t>
+            </w:r>
+          </w:p>
+        </w:tc>
+        <w:tc>
+          <w:tcPr>
+            <w:tcW w:type="dxa" w:w="4320"/>
+          </w:tcPr>
+          <w:p>
+            <w:r>
+              <w:rPr>
+                <w:sz w:val="18"/>
+              </w:rPr>
+              <w:t>This is a platform limitation for webhook-based ingestion. Logs are queryable by `_lm.logsource_name` and extracted fields.</w:t>
+            </w:r>
+          </w:p>
+        </w:tc>
+      </w:tr>
+      <w:tr>
+        <w:tc>
+          <w:tcPr>
+            <w:tcW w:type="dxa" w:w="4320"/>
+          </w:tcPr>
+          <w:p>
+            <w:r>
+              <w:rPr>
+                <w:sz w:val="18"/>
+              </w:rPr>
               <w:t>Egress blocked (managed platforms)</w:t>
             </w:r>
           </w:p>
@@ -1931,7 +3148,10 @@
           </w:tcPr>
           <w:p>
             <w:r>
-              <w:t>Whitelist *.logicmonitor.com:443 in egress firewall rules</w:t>
+              <w:rPr>
+                <w:sz w:val="18"/>
+              </w:rPr>
+              <w:t>Whitelist `*.logicmonitor.com:443` in egress firewall rules</w:t>
             </w:r>
           </w:p>
         </w:tc>
@@ -2310,9 +3530,12 @@
     <w:name w:val="Normal"/>
     <w:qFormat/>
     <w:rsid w:val="00FC693F"/>
+    <w:pPr>
+      <w:spacing w:after="80"/>
+    </w:pPr>
     <w:rPr>
       <w:rFonts w:ascii="Calibri" w:hAnsi="Calibri"/>
-      <w:sz w:val="22"/>
+      <w:sz w:val="20"/>
     </w:rPr>
   </w:style>
   <w:style w:type="paragraph" w:styleId="Header">

</xml_diff>